<commit_message>
feat: add rental contract templates and generation prompt
</commit_message>
<xml_diff>
--- a/contract-template/HomeSpace_01_Hop_Dong_Thue_Nha_Nguyen_Can.docx
+++ b/contract-template/HomeSpace_01_Hop_Dong_Thue_Nha_Nguyen_Can.docx
@@ -5,9 +5,9 @@
     <w:p>
       <w:pPr>
         <w:keepNext w:val="0"/>
-        <w:spacing w:before="0" w:after="0" w:line="269" w:lineRule="auto"/>
-        <w:ind w:left="0"/>
+        <w:spacing w:before="0" w:after="40" w:line="276" w:lineRule="auto"/>
         <w:jc w:val="center"/>
+        <w:widowControl w:val="1"/>
       </w:pPr>
       <w:r>
         <w:rPr>
@@ -22,9 +22,9 @@
     <w:p>
       <w:pPr>
         <w:keepNext w:val="0"/>
-        <w:spacing w:before="0" w:after="140" w:line="269" w:lineRule="auto"/>
-        <w:ind w:left="0"/>
+        <w:spacing w:before="0" w:after="240" w:line="276" w:lineRule="auto"/>
         <w:jc w:val="center"/>
+        <w:widowControl w:val="1"/>
       </w:pPr>
       <w:r>
         <w:rPr>
@@ -39,16 +39,16 @@
     <w:p>
       <w:pPr>
         <w:keepNext w:val="0"/>
-        <w:spacing w:before="0" w:after="40" w:line="269" w:lineRule="auto"/>
-        <w:ind w:left="0"/>
+        <w:spacing w:before="0" w:after="120" w:line="276" w:lineRule="auto"/>
         <w:jc w:val="center"/>
+        <w:widowControl w:val="1"/>
       </w:pPr>
       <w:r>
         <w:rPr>
           <w:rFonts w:ascii="Times New Roman" w:hAnsi="Times New Roman" w:eastAsia="Times New Roman"/>
           <w:b/>
           <w:i w:val="0"/>
-          <w:sz w:val="30"/>
+          <w:sz w:val="32"/>
         </w:rPr>
         <w:t>HỢP ĐỒNG THUÊ NHÀ NGUYÊN CĂN</w:t>
       </w:r>
@@ -56,16 +56,16 @@
     <w:p>
       <w:pPr>
         <w:keepNext w:val="0"/>
-        <w:spacing w:before="0" w:after="100" w:line="269" w:lineRule="auto"/>
-        <w:ind w:left="0"/>
+        <w:spacing w:before="0" w:after="160" w:line="276" w:lineRule="auto"/>
         <w:jc w:val="center"/>
+        <w:widowControl w:val="1"/>
       </w:pPr>
       <w:r>
         <w:rPr>
           <w:rFonts w:ascii="Times New Roman" w:hAnsi="Times New Roman" w:eastAsia="Times New Roman"/>
           <w:b w:val="0"/>
           <w:i w:val="0"/>
-          <w:sz w:val="24"/>
+          <w:sz w:val="22"/>
         </w:rPr>
         <w:t xml:space="preserve">Số: </w:t>
       </w:r>
@@ -74,7 +74,7 @@
           <w:rFonts w:ascii="Times New Roman" w:hAnsi="Times New Roman" w:eastAsia="Times New Roman"/>
           <w:b/>
           <w:i w:val="0"/>
-          <w:sz w:val="24"/>
+          <w:sz w:val="22"/>
         </w:rPr>
         <w:t>{{contract.number}}</w:t>
       </w:r>
@@ -83,7 +83,7 @@
           <w:rFonts w:ascii="Times New Roman" w:hAnsi="Times New Roman" w:eastAsia="Times New Roman"/>
           <w:b w:val="0"/>
           <w:i w:val="0"/>
-          <w:sz w:val="24"/>
+          <w:sz w:val="22"/>
         </w:rPr>
         <w:t xml:space="preserve"> - Ngày ký: </w:t>
       </w:r>
@@ -92,7 +92,7 @@
           <w:rFonts w:ascii="Times New Roman" w:hAnsi="Times New Roman" w:eastAsia="Times New Roman"/>
           <w:b w:val="0"/>
           <w:i w:val="0"/>
-          <w:sz w:val="24"/>
+          <w:sz w:val="22"/>
         </w:rPr>
         <w:t>{{contract.signingDate}}</w:t>
       </w:r>
@@ -101,7 +101,7 @@
           <w:rFonts w:ascii="Times New Roman" w:hAnsi="Times New Roman" w:eastAsia="Times New Roman"/>
           <w:b w:val="0"/>
           <w:i w:val="0"/>
-          <w:sz w:val="24"/>
+          <w:sz w:val="22"/>
         </w:rPr>
         <w:t xml:space="preserve"> tại </w:t>
       </w:r>
@@ -110,17 +110,26 @@
           <w:rFonts w:ascii="Times New Roman" w:hAnsi="Times New Roman" w:eastAsia="Times New Roman"/>
           <w:b w:val="0"/>
           <w:i w:val="0"/>
-          <w:sz w:val="24"/>
+          <w:sz w:val="22"/>
         </w:rPr>
         <w:t>{{contract.signingCity}}</w:t>
+      </w:r>
+      <w:r>
+        <w:rPr>
+          <w:rFonts w:ascii="Times New Roman" w:hAnsi="Times New Roman" w:eastAsia="Times New Roman"/>
+          <w:b w:val="0"/>
+          <w:i w:val="0"/>
+          <w:sz w:val="22"/>
+        </w:rPr>
+        <w:t>.</w:t>
       </w:r>
     </w:p>
     <w:p>
       <w:pPr>
         <w:keepNext/>
-        <w:spacing w:before="100" w:after="60" w:line="269" w:lineRule="auto"/>
-        <w:ind w:left="0"/>
-        <w:jc w:val="left"/>
+        <w:spacing w:before="160" w:after="80" w:line="276" w:lineRule="auto"/>
+        <w:jc w:val="both"/>
+        <w:widowControl w:val="1"/>
       </w:pPr>
       <w:r>
         <w:rPr>
@@ -135,16 +144,17 @@
     <w:p>
       <w:pPr>
         <w:keepNext w:val="0"/>
-        <w:spacing w:before="0" w:after="30" w:line="269" w:lineRule="auto"/>
-        <w:ind w:left="312" w:hanging="170"/>
+        <w:spacing w:before="0" w:after="80" w:line="276" w:lineRule="auto"/>
+        <w:ind w:left="255" w:hanging="142"/>
         <w:jc w:val="both"/>
+        <w:widowControl w:val="1"/>
       </w:pPr>
       <w:r>
         <w:rPr>
           <w:rFonts w:ascii="Times New Roman" w:hAnsi="Times New Roman" w:eastAsia="Times New Roman"/>
           <w:b w:val="0"/>
           <w:i w:val="0"/>
-          <w:sz w:val="26"/>
+          <w:sz w:val="24"/>
         </w:rPr>
         <w:t>• Bộ luật Dân sự số 91/2015/QH13;</w:t>
       </w:r>
@@ -152,16 +162,17 @@
     <w:p>
       <w:pPr>
         <w:keepNext w:val="0"/>
-        <w:spacing w:before="0" w:after="30" w:line="269" w:lineRule="auto"/>
-        <w:ind w:left="312" w:hanging="170"/>
+        <w:spacing w:before="0" w:after="80" w:line="276" w:lineRule="auto"/>
+        <w:ind w:left="255" w:hanging="142"/>
         <w:jc w:val="both"/>
+        <w:widowControl w:val="1"/>
       </w:pPr>
       <w:r>
         <w:rPr>
           <w:rFonts w:ascii="Times New Roman" w:hAnsi="Times New Roman" w:eastAsia="Times New Roman"/>
           <w:b w:val="0"/>
           <w:i w:val="0"/>
-          <w:sz w:val="26"/>
+          <w:sz w:val="24"/>
         </w:rPr>
         <w:t>• Luật Nhà ở số 27/2023/QH15;</w:t>
       </w:r>
@@ -169,16 +180,17 @@
     <w:p>
       <w:pPr>
         <w:keepNext w:val="0"/>
-        <w:spacing w:before="0" w:after="30" w:line="269" w:lineRule="auto"/>
-        <w:ind w:left="312" w:hanging="170"/>
+        <w:spacing w:before="0" w:after="80" w:line="276" w:lineRule="auto"/>
+        <w:ind w:left="255" w:hanging="142"/>
         <w:jc w:val="both"/>
+        <w:widowControl w:val="1"/>
       </w:pPr>
       <w:r>
         <w:rPr>
           <w:rFonts w:ascii="Times New Roman" w:hAnsi="Times New Roman" w:eastAsia="Times New Roman"/>
           <w:b w:val="0"/>
           <w:i w:val="0"/>
-          <w:sz w:val="26"/>
+          <w:sz w:val="24"/>
         </w:rPr>
         <w:t>• Luật Giao dịch điện tử số 20/2023/QH15;</w:t>
       </w:r>
@@ -186,16 +198,17 @@
     <w:p>
       <w:pPr>
         <w:keepNext w:val="0"/>
-        <w:spacing w:before="0" w:after="30" w:line="269" w:lineRule="auto"/>
-        <w:ind w:left="312" w:hanging="170"/>
+        <w:spacing w:before="0" w:after="80" w:line="276" w:lineRule="auto"/>
+        <w:ind w:left="255" w:hanging="142"/>
         <w:jc w:val="both"/>
+        <w:widowControl w:val="1"/>
       </w:pPr>
       <w:r>
         <w:rPr>
           <w:rFonts w:ascii="Times New Roman" w:hAnsi="Times New Roman" w:eastAsia="Times New Roman"/>
           <w:b w:val="0"/>
           <w:i w:val="0"/>
-          <w:sz w:val="26"/>
+          <w:sz w:val="24"/>
         </w:rPr>
         <w:t>• Luật Cư trú số 68/2020/QH14;</w:t>
       </w:r>
@@ -203,16 +216,17 @@
     <w:p>
       <w:pPr>
         <w:keepNext w:val="0"/>
-        <w:spacing w:before="0" w:after="30" w:line="269" w:lineRule="auto"/>
-        <w:ind w:left="312" w:hanging="170"/>
+        <w:spacing w:before="0" w:after="80" w:line="276" w:lineRule="auto"/>
+        <w:ind w:left="255" w:hanging="142"/>
         <w:jc w:val="both"/>
+        <w:widowControl w:val="1"/>
       </w:pPr>
       <w:r>
         <w:rPr>
           <w:rFonts w:ascii="Times New Roman" w:hAnsi="Times New Roman" w:eastAsia="Times New Roman"/>
           <w:b w:val="0"/>
           <w:i w:val="0"/>
-          <w:sz w:val="26"/>
+          <w:sz w:val="24"/>
         </w:rPr>
         <w:t>• Luật Phòng cháy, chữa cháy và cứu nạn, cứu hộ số 55/2024/QH15;</w:t>
       </w:r>
@@ -220,16 +234,17 @@
     <w:p>
       <w:pPr>
         <w:keepNext w:val="0"/>
-        <w:spacing w:before="0" w:after="30" w:line="269" w:lineRule="auto"/>
-        <w:ind w:left="312" w:hanging="170"/>
+        <w:spacing w:before="0" w:after="80" w:line="276" w:lineRule="auto"/>
+        <w:ind w:left="255" w:hanging="142"/>
         <w:jc w:val="both"/>
+        <w:widowControl w:val="1"/>
       </w:pPr>
       <w:r>
         <w:rPr>
           <w:rFonts w:ascii="Times New Roman" w:hAnsi="Times New Roman" w:eastAsia="Times New Roman"/>
           <w:b w:val="0"/>
           <w:i w:val="0"/>
-          <w:sz w:val="26"/>
+          <w:sz w:val="24"/>
         </w:rPr>
         <w:t>• Luật Kinh doanh bất động sản số 29/2023/QH15 (trong phạm vi áp dụng).</w:t>
       </w:r>
@@ -237,9 +252,9 @@
     <w:p>
       <w:pPr>
         <w:keepNext/>
-        <w:spacing w:before="100" w:after="60" w:line="269" w:lineRule="auto"/>
-        <w:ind w:left="0"/>
-        <w:jc w:val="left"/>
+        <w:spacing w:before="160" w:after="80" w:line="276" w:lineRule="auto"/>
+        <w:jc w:val="both"/>
+        <w:widowControl w:val="1"/>
       </w:pPr>
       <w:r>
         <w:rPr>
@@ -254,16 +269,16 @@
     <w:p>
       <w:pPr>
         <w:keepNext w:val="0"/>
-        <w:spacing w:before="0" w:after="40" w:line="269" w:lineRule="auto"/>
-        <w:ind w:left="0"/>
+        <w:spacing w:before="0" w:after="80" w:line="276" w:lineRule="auto"/>
         <w:jc w:val="both"/>
+        <w:widowControl w:val="1"/>
       </w:pPr>
       <w:r>
         <w:rPr>
           <w:rFonts w:ascii="Times New Roman" w:hAnsi="Times New Roman" w:eastAsia="Times New Roman"/>
           <w:b/>
           <w:i w:val="0"/>
-          <w:sz w:val="26"/>
+          <w:sz w:val="24"/>
         </w:rPr>
         <w:t xml:space="preserve">BÊN CHO THUÊ (BÊN A): </w:t>
       </w:r>
@@ -272,7 +287,7 @@
           <w:rFonts w:ascii="Times New Roman" w:hAnsi="Times New Roman" w:eastAsia="Times New Roman"/>
           <w:b/>
           <w:i w:val="0"/>
-          <w:sz w:val="26"/>
+          <w:sz w:val="24"/>
         </w:rPr>
         <w:t>{{landlord.fullName}}</w:t>
       </w:r>
@@ -280,16 +295,16 @@
     <w:p>
       <w:pPr>
         <w:keepNext w:val="0"/>
-        <w:spacing w:before="0" w:after="40" w:line="269" w:lineRule="auto"/>
-        <w:ind w:left="0"/>
+        <w:spacing w:before="0" w:after="80" w:line="276" w:lineRule="auto"/>
         <w:jc w:val="both"/>
+        <w:widowControl w:val="1"/>
       </w:pPr>
       <w:r>
         <w:rPr>
           <w:rFonts w:ascii="Times New Roman" w:hAnsi="Times New Roman" w:eastAsia="Times New Roman"/>
           <w:b w:val="0"/>
           <w:i w:val="0"/>
-          <w:sz w:val="26"/>
+          <w:sz w:val="24"/>
         </w:rPr>
         <w:t xml:space="preserve">CCCD/Hộ chiếu: </w:t>
       </w:r>
@@ -298,7 +313,7 @@
           <w:rFonts w:ascii="Times New Roman" w:hAnsi="Times New Roman" w:eastAsia="Times New Roman"/>
           <w:b w:val="0"/>
           <w:i w:val="0"/>
-          <w:sz w:val="26"/>
+          <w:sz w:val="24"/>
         </w:rPr>
         <w:t>{{landlord.idNumber}}</w:t>
       </w:r>
@@ -307,7 +322,7 @@
           <w:rFonts w:ascii="Times New Roman" w:hAnsi="Times New Roman" w:eastAsia="Times New Roman"/>
           <w:b w:val="0"/>
           <w:i w:val="0"/>
-          <w:sz w:val="26"/>
+          <w:sz w:val="24"/>
         </w:rPr>
         <w:t xml:space="preserve">; Thường trú: </w:t>
       </w:r>
@@ -316,24 +331,33 @@
           <w:rFonts w:ascii="Times New Roman" w:hAnsi="Times New Roman" w:eastAsia="Times New Roman"/>
           <w:b w:val="0"/>
           <w:i w:val="0"/>
-          <w:sz w:val="26"/>
+          <w:sz w:val="24"/>
         </w:rPr>
         <w:t>{{landlord.permanentAddress}}</w:t>
+      </w:r>
+      <w:r>
+        <w:rPr>
+          <w:rFonts w:ascii="Times New Roman" w:hAnsi="Times New Roman" w:eastAsia="Times New Roman"/>
+          <w:b w:val="0"/>
+          <w:i w:val="0"/>
+          <w:sz w:val="24"/>
+        </w:rPr>
+        <w:t>.</w:t>
       </w:r>
     </w:p>
     <w:p>
       <w:pPr>
         <w:keepNext w:val="0"/>
-        <w:spacing w:before="0" w:after="40" w:line="269" w:lineRule="auto"/>
-        <w:ind w:left="0"/>
+        <w:spacing w:before="0" w:after="80" w:line="276" w:lineRule="auto"/>
         <w:jc w:val="both"/>
+        <w:widowControl w:val="1"/>
       </w:pPr>
       <w:r>
         <w:rPr>
           <w:rFonts w:ascii="Times New Roman" w:hAnsi="Times New Roman" w:eastAsia="Times New Roman"/>
           <w:b w:val="0"/>
           <w:i w:val="0"/>
-          <w:sz w:val="26"/>
+          <w:sz w:val="24"/>
         </w:rPr>
         <w:t xml:space="preserve">Điện thoại: </w:t>
       </w:r>
@@ -342,7 +366,7 @@
           <w:rFonts w:ascii="Times New Roman" w:hAnsi="Times New Roman" w:eastAsia="Times New Roman"/>
           <w:b w:val="0"/>
           <w:i w:val="0"/>
-          <w:sz w:val="26"/>
+          <w:sz w:val="24"/>
         </w:rPr>
         <w:t>{{landlord.phone}}</w:t>
       </w:r>
@@ -351,7 +375,7 @@
           <w:rFonts w:ascii="Times New Roman" w:hAnsi="Times New Roman" w:eastAsia="Times New Roman"/>
           <w:b w:val="0"/>
           <w:i w:val="0"/>
-          <w:sz w:val="26"/>
+          <w:sz w:val="24"/>
         </w:rPr>
         <w:t xml:space="preserve">; Email: </w:t>
       </w:r>
@@ -360,33 +384,42 @@
           <w:rFonts w:ascii="Times New Roman" w:hAnsi="Times New Roman" w:eastAsia="Times New Roman"/>
           <w:b w:val="0"/>
           <w:i w:val="0"/>
-          <w:sz w:val="26"/>
+          <w:sz w:val="24"/>
         </w:rPr>
         <w:t>{{landlord.email}}</w:t>
+      </w:r>
+      <w:r>
+        <w:rPr>
+          <w:rFonts w:ascii="Times New Roman" w:hAnsi="Times New Roman" w:eastAsia="Times New Roman"/>
+          <w:b w:val="0"/>
+          <w:i w:val="0"/>
+          <w:sz w:val="24"/>
+        </w:rPr>
+        <w:t>.</w:t>
       </w:r>
     </w:p>
     <w:p>
       <w:pPr>
         <w:keepNext w:val="0"/>
-        <w:spacing w:before="0" w:after="40" w:line="269" w:lineRule="auto"/>
-        <w:ind w:left="0"/>
+        <w:spacing w:before="0" w:after="80" w:line="276" w:lineRule="auto"/>
         <w:jc w:val="both"/>
+        <w:widowControl w:val="1"/>
       </w:pPr>
       <w:r>
         <w:rPr>
           <w:rFonts w:ascii="Times New Roman" w:hAnsi="Times New Roman" w:eastAsia="Times New Roman"/>
           <w:b w:val="0"/>
           <w:i w:val="0"/>
-          <w:sz w:val="26"/>
+          <w:sz w:val="24"/>
         </w:rPr>
-        <w:t xml:space="preserve">Tài khoản nhận thanh toán - Chủ tài khoản: </w:t>
+        <w:t xml:space="preserve">Tài khoản nhận thanh toán: Chủ tài khoản: </w:t>
       </w:r>
       <w:r>
         <w:rPr>
           <w:rFonts w:ascii="Times New Roman" w:hAnsi="Times New Roman" w:eastAsia="Times New Roman"/>
           <w:b w:val="0"/>
           <w:i w:val="0"/>
-          <w:sz w:val="26"/>
+          <w:sz w:val="24"/>
         </w:rPr>
         <w:t>{{landlord.bankAccountHolder}}</w:t>
       </w:r>
@@ -395,16 +428,16 @@
           <w:rFonts w:ascii="Times New Roman" w:hAnsi="Times New Roman" w:eastAsia="Times New Roman"/>
           <w:b w:val="0"/>
           <w:i w:val="0"/>
-          <w:sz w:val="26"/>
+          <w:sz w:val="24"/>
         </w:rPr>
-        <w:t xml:space="preserve">; Số tài khoản: </w:t>
+        <w:t xml:space="preserve"> - Số tài khoản: </w:t>
       </w:r>
       <w:r>
         <w:rPr>
           <w:rFonts w:ascii="Times New Roman" w:hAnsi="Times New Roman" w:eastAsia="Times New Roman"/>
           <w:b w:val="0"/>
           <w:i w:val="0"/>
-          <w:sz w:val="26"/>
+          <w:sz w:val="24"/>
         </w:rPr>
         <w:t>{{landlord.bankAccountNumber}}</w:t>
       </w:r>
@@ -413,33 +446,42 @@
           <w:rFonts w:ascii="Times New Roman" w:hAnsi="Times New Roman" w:eastAsia="Times New Roman"/>
           <w:b w:val="0"/>
           <w:i w:val="0"/>
-          <w:sz w:val="26"/>
+          <w:sz w:val="24"/>
         </w:rPr>
-        <w:t xml:space="preserve">; Ngân hàng: </w:t>
+        <w:t xml:space="preserve"> - Ngân hàng: </w:t>
       </w:r>
       <w:r>
         <w:rPr>
           <w:rFonts w:ascii="Times New Roman" w:hAnsi="Times New Roman" w:eastAsia="Times New Roman"/>
           <w:b w:val="0"/>
           <w:i w:val="0"/>
-          <w:sz w:val="26"/>
+          <w:sz w:val="24"/>
         </w:rPr>
         <w:t>{{landlord.bankName}}</w:t>
+      </w:r>
+      <w:r>
+        <w:rPr>
+          <w:rFonts w:ascii="Times New Roman" w:hAnsi="Times New Roman" w:eastAsia="Times New Roman"/>
+          <w:b w:val="0"/>
+          <w:i w:val="0"/>
+          <w:sz w:val="24"/>
+        </w:rPr>
+        <w:t>.</w:t>
       </w:r>
     </w:p>
     <w:p>
       <w:pPr>
         <w:keepNext w:val="0"/>
-        <w:spacing w:before="0" w:after="40" w:line="269" w:lineRule="auto"/>
-        <w:ind w:left="0"/>
+        <w:spacing w:before="0" w:after="80" w:line="276" w:lineRule="auto"/>
         <w:jc w:val="both"/>
+        <w:widowControl w:val="1"/>
       </w:pPr>
       <w:r>
         <w:rPr>
           <w:rFonts w:ascii="Times New Roman" w:hAnsi="Times New Roman" w:eastAsia="Times New Roman"/>
           <w:b/>
           <w:i w:val="0"/>
-          <w:sz w:val="26"/>
+          <w:sz w:val="24"/>
         </w:rPr>
         <w:t xml:space="preserve">BÊN THUÊ (BÊN B): </w:t>
       </w:r>
@@ -448,7 +490,7 @@
           <w:rFonts w:ascii="Times New Roman" w:hAnsi="Times New Roman" w:eastAsia="Times New Roman"/>
           <w:b/>
           <w:i w:val="0"/>
-          <w:sz w:val="26"/>
+          <w:sz w:val="24"/>
         </w:rPr>
         <w:t>{{tenant.fullName}}</w:t>
       </w:r>
@@ -456,16 +498,16 @@
     <w:p>
       <w:pPr>
         <w:keepNext w:val="0"/>
-        <w:spacing w:before="0" w:after="40" w:line="269" w:lineRule="auto"/>
-        <w:ind w:left="0"/>
+        <w:spacing w:before="0" w:after="80" w:line="276" w:lineRule="auto"/>
         <w:jc w:val="both"/>
+        <w:widowControl w:val="1"/>
       </w:pPr>
       <w:r>
         <w:rPr>
           <w:rFonts w:ascii="Times New Roman" w:hAnsi="Times New Roman" w:eastAsia="Times New Roman"/>
           <w:b w:val="0"/>
           <w:i w:val="0"/>
-          <w:sz w:val="26"/>
+          <w:sz w:val="24"/>
         </w:rPr>
         <w:t xml:space="preserve">CCCD/Hộ chiếu: </w:t>
       </w:r>
@@ -474,7 +516,7 @@
           <w:rFonts w:ascii="Times New Roman" w:hAnsi="Times New Roman" w:eastAsia="Times New Roman"/>
           <w:b w:val="0"/>
           <w:i w:val="0"/>
-          <w:sz w:val="26"/>
+          <w:sz w:val="24"/>
         </w:rPr>
         <w:t>{{tenant.idNumber}}</w:t>
       </w:r>
@@ -483,7 +525,7 @@
           <w:rFonts w:ascii="Times New Roman" w:hAnsi="Times New Roman" w:eastAsia="Times New Roman"/>
           <w:b w:val="0"/>
           <w:i w:val="0"/>
-          <w:sz w:val="26"/>
+          <w:sz w:val="24"/>
         </w:rPr>
         <w:t xml:space="preserve">; Thường trú: </w:t>
       </w:r>
@@ -492,24 +534,33 @@
           <w:rFonts w:ascii="Times New Roman" w:hAnsi="Times New Roman" w:eastAsia="Times New Roman"/>
           <w:b w:val="0"/>
           <w:i w:val="0"/>
-          <w:sz w:val="26"/>
+          <w:sz w:val="24"/>
         </w:rPr>
         <w:t>{{tenant.permanentAddress}}</w:t>
+      </w:r>
+      <w:r>
+        <w:rPr>
+          <w:rFonts w:ascii="Times New Roman" w:hAnsi="Times New Roman" w:eastAsia="Times New Roman"/>
+          <w:b w:val="0"/>
+          <w:i w:val="0"/>
+          <w:sz w:val="24"/>
+        </w:rPr>
+        <w:t>.</w:t>
       </w:r>
     </w:p>
     <w:p>
       <w:pPr>
         <w:keepNext w:val="0"/>
-        <w:spacing w:before="0" w:after="40" w:line="269" w:lineRule="auto"/>
-        <w:ind w:left="0"/>
+        <w:spacing w:before="0" w:after="80" w:line="276" w:lineRule="auto"/>
         <w:jc w:val="both"/>
+        <w:widowControl w:val="1"/>
       </w:pPr>
       <w:r>
         <w:rPr>
           <w:rFonts w:ascii="Times New Roman" w:hAnsi="Times New Roman" w:eastAsia="Times New Roman"/>
           <w:b w:val="0"/>
           <w:i w:val="0"/>
-          <w:sz w:val="26"/>
+          <w:sz w:val="24"/>
         </w:rPr>
         <w:t xml:space="preserve">Điện thoại: </w:t>
       </w:r>
@@ -518,7 +569,7 @@
           <w:rFonts w:ascii="Times New Roman" w:hAnsi="Times New Roman" w:eastAsia="Times New Roman"/>
           <w:b w:val="0"/>
           <w:i w:val="0"/>
-          <w:sz w:val="26"/>
+          <w:sz w:val="24"/>
         </w:rPr>
         <w:t>{{tenant.phone}}</w:t>
       </w:r>
@@ -527,7 +578,7 @@
           <w:rFonts w:ascii="Times New Roman" w:hAnsi="Times New Roman" w:eastAsia="Times New Roman"/>
           <w:b w:val="0"/>
           <w:i w:val="0"/>
-          <w:sz w:val="26"/>
+          <w:sz w:val="24"/>
         </w:rPr>
         <w:t xml:space="preserve">; Email: </w:t>
       </w:r>
@@ -536,24 +587,33 @@
           <w:rFonts w:ascii="Times New Roman" w:hAnsi="Times New Roman" w:eastAsia="Times New Roman"/>
           <w:b w:val="0"/>
           <w:i w:val="0"/>
-          <w:sz w:val="26"/>
+          <w:sz w:val="24"/>
         </w:rPr>
         <w:t>{{tenant.email}}</w:t>
+      </w:r>
+      <w:r>
+        <w:rPr>
+          <w:rFonts w:ascii="Times New Roman" w:hAnsi="Times New Roman" w:eastAsia="Times New Roman"/>
+          <w:b w:val="0"/>
+          <w:i w:val="0"/>
+          <w:sz w:val="24"/>
+        </w:rPr>
+        <w:t>.</w:t>
       </w:r>
     </w:p>
     <w:p>
       <w:pPr>
         <w:keepNext w:val="0"/>
-        <w:spacing w:before="0" w:after="40" w:line="269" w:lineRule="auto"/>
-        <w:ind w:left="0"/>
+        <w:spacing w:before="0" w:after="80" w:line="276" w:lineRule="auto"/>
         <w:jc w:val="both"/>
+        <w:widowControl w:val="1"/>
       </w:pPr>
       <w:r>
         <w:rPr>
           <w:rFonts w:ascii="Times New Roman" w:hAnsi="Times New Roman" w:eastAsia="Times New Roman"/>
           <w:b w:val="0"/>
           <w:i w:val="0"/>
-          <w:sz w:val="26"/>
+          <w:sz w:val="24"/>
         </w:rPr>
         <w:t xml:space="preserve">Số người cư trú: </w:t>
       </w:r>
@@ -562,7 +622,7 @@
           <w:rFonts w:ascii="Times New Roman" w:hAnsi="Times New Roman" w:eastAsia="Times New Roman"/>
           <w:b w:val="0"/>
           <w:i w:val="0"/>
-          <w:sz w:val="26"/>
+          <w:sz w:val="24"/>
         </w:rPr>
         <w:t>{{tenant.occupantCount}}</w:t>
       </w:r>
@@ -571,7 +631,7 @@
           <w:rFonts w:ascii="Times New Roman" w:hAnsi="Times New Roman" w:eastAsia="Times New Roman"/>
           <w:b w:val="0"/>
           <w:i w:val="0"/>
-          <w:sz w:val="26"/>
+          <w:sz w:val="24"/>
         </w:rPr>
         <w:t xml:space="preserve">; Xe máy đăng ký: </w:t>
       </w:r>
@@ -580,7 +640,7 @@
           <w:rFonts w:ascii="Times New Roman" w:hAnsi="Times New Roman" w:eastAsia="Times New Roman"/>
           <w:b w:val="0"/>
           <w:i w:val="0"/>
-          <w:sz w:val="26"/>
+          <w:sz w:val="24"/>
         </w:rPr>
         <w:t>{{tenant.motorbikeCount}}</w:t>
       </w:r>
@@ -589,7 +649,7 @@
           <w:rFonts w:ascii="Times New Roman" w:hAnsi="Times New Roman" w:eastAsia="Times New Roman"/>
           <w:b w:val="0"/>
           <w:i w:val="0"/>
-          <w:sz w:val="26"/>
+          <w:sz w:val="24"/>
         </w:rPr>
         <w:t xml:space="preserve">; Ô tô đăng ký: </w:t>
       </w:r>
@@ -598,33 +658,42 @@
           <w:rFonts w:ascii="Times New Roman" w:hAnsi="Times New Roman" w:eastAsia="Times New Roman"/>
           <w:b w:val="0"/>
           <w:i w:val="0"/>
-          <w:sz w:val="26"/>
+          <w:sz w:val="24"/>
         </w:rPr>
         <w:t>{{tenant.carCount}}</w:t>
+      </w:r>
+      <w:r>
+        <w:rPr>
+          <w:rFonts w:ascii="Times New Roman" w:hAnsi="Times New Roman" w:eastAsia="Times New Roman"/>
+          <w:b w:val="0"/>
+          <w:i w:val="0"/>
+          <w:sz w:val="24"/>
+        </w:rPr>
+        <w:t>.</w:t>
       </w:r>
     </w:p>
     <w:p>
       <w:pPr>
         <w:keepNext w:val="0"/>
-        <w:spacing w:before="0" w:after="40" w:line="269" w:lineRule="auto"/>
-        <w:ind w:left="0"/>
+        <w:spacing w:before="0" w:after="80" w:line="276" w:lineRule="auto"/>
         <w:jc w:val="both"/>
+        <w:widowControl w:val="1"/>
       </w:pPr>
       <w:r>
         <w:rPr>
           <w:rFonts w:ascii="Times New Roman" w:hAnsi="Times New Roman" w:eastAsia="Times New Roman"/>
           <w:b w:val="0"/>
           <w:i w:val="0"/>
-          <w:sz w:val="26"/>
+          <w:sz w:val="24"/>
         </w:rPr>
-        <w:t xml:space="preserve">Tài khoản nhận hoàn trả - Chủ tài khoản: </w:t>
+        <w:t xml:space="preserve">Tài khoản nhận hoàn trả: Chủ tài khoản: </w:t>
       </w:r>
       <w:r>
         <w:rPr>
           <w:rFonts w:ascii="Times New Roman" w:hAnsi="Times New Roman" w:eastAsia="Times New Roman"/>
           <w:b w:val="0"/>
           <w:i w:val="0"/>
-          <w:sz w:val="26"/>
+          <w:sz w:val="24"/>
         </w:rPr>
         <w:t>{{tenant.bankAccountHolder}}</w:t>
       </w:r>
@@ -633,16 +702,16 @@
           <w:rFonts w:ascii="Times New Roman" w:hAnsi="Times New Roman" w:eastAsia="Times New Roman"/>
           <w:b w:val="0"/>
           <w:i w:val="0"/>
-          <w:sz w:val="26"/>
+          <w:sz w:val="24"/>
         </w:rPr>
-        <w:t xml:space="preserve">; Số tài khoản: </w:t>
+        <w:t xml:space="preserve"> - Số tài khoản: </w:t>
       </w:r>
       <w:r>
         <w:rPr>
           <w:rFonts w:ascii="Times New Roman" w:hAnsi="Times New Roman" w:eastAsia="Times New Roman"/>
           <w:b w:val="0"/>
           <w:i w:val="0"/>
-          <w:sz w:val="26"/>
+          <w:sz w:val="24"/>
         </w:rPr>
         <w:t>{{tenant.bankAccountNumber}}</w:t>
       </w:r>
@@ -651,26 +720,35 @@
           <w:rFonts w:ascii="Times New Roman" w:hAnsi="Times New Roman" w:eastAsia="Times New Roman"/>
           <w:b w:val="0"/>
           <w:i w:val="0"/>
-          <w:sz w:val="26"/>
+          <w:sz w:val="24"/>
         </w:rPr>
-        <w:t xml:space="preserve">; Ngân hàng: </w:t>
+        <w:t xml:space="preserve"> - Ngân hàng: </w:t>
       </w:r>
       <w:r>
         <w:rPr>
           <w:rFonts w:ascii="Times New Roman" w:hAnsi="Times New Roman" w:eastAsia="Times New Roman"/>
           <w:b w:val="0"/>
           <w:i w:val="0"/>
-          <w:sz w:val="26"/>
+          <w:sz w:val="24"/>
         </w:rPr>
         <w:t>{{tenant.bankName}}</w:t>
+      </w:r>
+      <w:r>
+        <w:rPr>
+          <w:rFonts w:ascii="Times New Roman" w:hAnsi="Times New Roman" w:eastAsia="Times New Roman"/>
+          <w:b w:val="0"/>
+          <w:i w:val="0"/>
+          <w:sz w:val="24"/>
+        </w:rPr>
+        <w:t>.</w:t>
       </w:r>
     </w:p>
     <w:p>
       <w:pPr>
         <w:keepNext/>
-        <w:spacing w:before="100" w:after="60" w:line="269" w:lineRule="auto"/>
-        <w:ind w:left="0"/>
-        <w:jc w:val="left"/>
+        <w:spacing w:before="160" w:after="80" w:line="276" w:lineRule="auto"/>
+        <w:jc w:val="both"/>
+        <w:widowControl w:val="1"/>
       </w:pPr>
       <w:r>
         <w:rPr>
@@ -685,16 +763,16 @@
     <w:p>
       <w:pPr>
         <w:keepNext w:val="0"/>
-        <w:spacing w:before="0" w:after="40" w:line="269" w:lineRule="auto"/>
-        <w:ind w:left="0"/>
+        <w:spacing w:before="0" w:after="80" w:line="276" w:lineRule="auto"/>
         <w:jc w:val="both"/>
+        <w:widowControl w:val="1"/>
       </w:pPr>
       <w:r>
         <w:rPr>
           <w:rFonts w:ascii="Times New Roman" w:hAnsi="Times New Roman" w:eastAsia="Times New Roman"/>
           <w:b w:val="0"/>
           <w:i w:val="0"/>
-          <w:sz w:val="26"/>
+          <w:sz w:val="24"/>
         </w:rPr>
         <w:t xml:space="preserve">1.1. Bên A đồng ý cho Bên B thuê toàn bộ căn nhà tại địa chỉ: </w:t>
       </w:r>
@@ -703,7 +781,7 @@
           <w:rFonts w:ascii="Times New Roman" w:hAnsi="Times New Roman" w:eastAsia="Times New Roman"/>
           <w:b w:val="0"/>
           <w:i w:val="0"/>
-          <w:sz w:val="26"/>
+          <w:sz w:val="24"/>
         </w:rPr>
         <w:t>{{property.fullAddress}}</w:t>
       </w:r>
@@ -712,7 +790,7 @@
           <w:rFonts w:ascii="Times New Roman" w:hAnsi="Times New Roman" w:eastAsia="Times New Roman"/>
           <w:b w:val="0"/>
           <w:i w:val="0"/>
-          <w:sz w:val="26"/>
+          <w:sz w:val="24"/>
         </w:rPr>
         <w:t>.</w:t>
       </w:r>
@@ -720,16 +798,16 @@
     <w:p>
       <w:pPr>
         <w:keepNext w:val="0"/>
-        <w:spacing w:before="0" w:after="40" w:line="269" w:lineRule="auto"/>
-        <w:ind w:left="0"/>
+        <w:spacing w:before="0" w:after="80" w:line="276" w:lineRule="auto"/>
         <w:jc w:val="both"/>
+        <w:widowControl w:val="1"/>
       </w:pPr>
       <w:r>
         <w:rPr>
           <w:rFonts w:ascii="Times New Roman" w:hAnsi="Times New Roman" w:eastAsia="Times New Roman"/>
           <w:b w:val="0"/>
           <w:i w:val="0"/>
-          <w:sz w:val="26"/>
+          <w:sz w:val="24"/>
         </w:rPr>
         <w:t xml:space="preserve">1.2. Diện tích: </w:t>
       </w:r>
@@ -738,7 +816,7 @@
           <w:rFonts w:ascii="Times New Roman" w:hAnsi="Times New Roman" w:eastAsia="Times New Roman"/>
           <w:b w:val="0"/>
           <w:i w:val="0"/>
-          <w:sz w:val="26"/>
+          <w:sz w:val="24"/>
         </w:rPr>
         <w:t>{{property.areaText}}</w:t>
       </w:r>
@@ -747,7 +825,25 @@
           <w:rFonts w:ascii="Times New Roman" w:hAnsi="Times New Roman" w:eastAsia="Times New Roman"/>
           <w:b w:val="0"/>
           <w:i w:val="0"/>
-          <w:sz w:val="26"/>
+          <w:sz w:val="24"/>
+        </w:rPr>
+        <w:t xml:space="preserve">; Kết cấu/Số tầng: </w:t>
+      </w:r>
+      <w:r>
+        <w:rPr>
+          <w:rFonts w:ascii="Times New Roman" w:hAnsi="Times New Roman" w:eastAsia="Times New Roman"/>
+          <w:b w:val="0"/>
+          <w:i w:val="0"/>
+          <w:sz w:val="24"/>
+        </w:rPr>
+        <w:t>{{property.floor}}</w:t>
+      </w:r>
+      <w:r>
+        <w:rPr>
+          <w:rFonts w:ascii="Times New Roman" w:hAnsi="Times New Roman" w:eastAsia="Times New Roman"/>
+          <w:b w:val="0"/>
+          <w:i w:val="0"/>
+          <w:sz w:val="24"/>
         </w:rPr>
         <w:t xml:space="preserve">; Loại tài sản: </w:t>
       </w:r>
@@ -756,7 +852,7 @@
           <w:rFonts w:ascii="Times New Roman" w:hAnsi="Times New Roman" w:eastAsia="Times New Roman"/>
           <w:b w:val="0"/>
           <w:i w:val="0"/>
-          <w:sz w:val="26"/>
+          <w:sz w:val="24"/>
         </w:rPr>
         <w:t>{{property.propertyType}}</w:t>
       </w:r>
@@ -765,25 +861,7 @@
           <w:rFonts w:ascii="Times New Roman" w:hAnsi="Times New Roman" w:eastAsia="Times New Roman"/>
           <w:b w:val="0"/>
           <w:i w:val="0"/>
-          <w:sz w:val="26"/>
-        </w:rPr>
-        <w:t xml:space="preserve">; Kết cấu/Số tầng: </w:t>
-      </w:r>
-      <w:r>
-        <w:rPr>
-          <w:rFonts w:ascii="Times New Roman" w:hAnsi="Times New Roman" w:eastAsia="Times New Roman"/>
-          <w:b w:val="0"/>
-          <w:i w:val="0"/>
-          <w:sz w:val="26"/>
-        </w:rPr>
-        <w:t>{{property.floor}}</w:t>
-      </w:r>
-      <w:r>
-        <w:rPr>
-          <w:rFonts w:ascii="Times New Roman" w:hAnsi="Times New Roman" w:eastAsia="Times New Roman"/>
-          <w:b w:val="0"/>
-          <w:i w:val="0"/>
-          <w:sz w:val="26"/>
+          <w:sz w:val="24"/>
         </w:rPr>
         <w:t xml:space="preserve">; Phạm vi thuê: </w:t>
       </w:r>
@@ -792,7 +870,7 @@
           <w:rFonts w:ascii="Times New Roman" w:hAnsi="Times New Roman" w:eastAsia="Times New Roman"/>
           <w:b w:val="0"/>
           <w:i w:val="0"/>
-          <w:sz w:val="26"/>
+          <w:sz w:val="24"/>
         </w:rPr>
         <w:t>{{property.rentalScope}}</w:t>
       </w:r>
@@ -801,7 +879,7 @@
           <w:rFonts w:ascii="Times New Roman" w:hAnsi="Times New Roman" w:eastAsia="Times New Roman"/>
           <w:b w:val="0"/>
           <w:i w:val="0"/>
-          <w:sz w:val="26"/>
+          <w:sz w:val="24"/>
         </w:rPr>
         <w:t xml:space="preserve">; Mã tin: </w:t>
       </w:r>
@@ -810,7 +888,7 @@
           <w:rFonts w:ascii="Times New Roman" w:hAnsi="Times New Roman" w:eastAsia="Times New Roman"/>
           <w:b w:val="0"/>
           <w:i w:val="0"/>
-          <w:sz w:val="26"/>
+          <w:sz w:val="24"/>
         </w:rPr>
         <w:t>{{property.listingCode}}</w:t>
       </w:r>
@@ -819,7 +897,7 @@
           <w:rFonts w:ascii="Times New Roman" w:hAnsi="Times New Roman" w:eastAsia="Times New Roman"/>
           <w:b w:val="0"/>
           <w:i w:val="0"/>
-          <w:sz w:val="26"/>
+          <w:sz w:val="24"/>
         </w:rPr>
         <w:t>.</w:t>
       </w:r>
@@ -827,25 +905,25 @@
     <w:p>
       <w:pPr>
         <w:keepNext w:val="0"/>
-        <w:spacing w:before="0" w:after="40" w:line="269" w:lineRule="auto"/>
-        <w:ind w:left="0"/>
+        <w:spacing w:before="0" w:after="80" w:line="276" w:lineRule="auto"/>
         <w:jc w:val="both"/>
+        <w:widowControl w:val="1"/>
       </w:pPr>
       <w:r>
         <w:rPr>
           <w:rFonts w:ascii="Times New Roman" w:hAnsi="Times New Roman" w:eastAsia="Times New Roman"/>
           <w:b w:val="0"/>
           <w:i w:val="0"/>
-          <w:sz w:val="26"/>
+          <w:sz w:val="24"/>
         </w:rPr>
-        <w:t xml:space="preserve">1.3. Số người tối đa cho phép theo nội quy: </w:t>
+        <w:t xml:space="preserve">1.3. Số người tối đa cho phép: </w:t>
       </w:r>
       <w:r>
         <w:rPr>
           <w:rFonts w:ascii="Times New Roman" w:hAnsi="Times New Roman" w:eastAsia="Times New Roman"/>
           <w:b w:val="0"/>
           <w:i w:val="0"/>
-          <w:sz w:val="26"/>
+          <w:sz w:val="24"/>
         </w:rPr>
         <w:t>{{property.maxOccupants}}</w:t>
       </w:r>
@@ -854,7 +932,7 @@
           <w:rFonts w:ascii="Times New Roman" w:hAnsi="Times New Roman" w:eastAsia="Times New Roman"/>
           <w:b w:val="0"/>
           <w:i w:val="0"/>
-          <w:sz w:val="26"/>
+          <w:sz w:val="24"/>
         </w:rPr>
         <w:t xml:space="preserve">; Số xe tối đa cho phép: </w:t>
       </w:r>
@@ -863,7 +941,7 @@
           <w:rFonts w:ascii="Times New Roman" w:hAnsi="Times New Roman" w:eastAsia="Times New Roman"/>
           <w:b w:val="0"/>
           <w:i w:val="0"/>
-          <w:sz w:val="26"/>
+          <w:sz w:val="24"/>
         </w:rPr>
         <w:t>{{property.maxVehicles}}</w:t>
       </w:r>
@@ -872,7 +950,7 @@
           <w:rFonts w:ascii="Times New Roman" w:hAnsi="Times New Roman" w:eastAsia="Times New Roman"/>
           <w:b w:val="0"/>
           <w:i w:val="0"/>
-          <w:sz w:val="26"/>
+          <w:sz w:val="24"/>
         </w:rPr>
         <w:t>.</w:t>
       </w:r>
@@ -880,16 +958,16 @@
     <w:p>
       <w:pPr>
         <w:keepNext/>
-        <w:spacing w:before="0" w:after="20" w:line="269" w:lineRule="auto"/>
-        <w:ind w:left="0"/>
+        <w:spacing w:before="0" w:after="40" w:line="276" w:lineRule="auto"/>
         <w:jc w:val="both"/>
+        <w:widowControl w:val="1"/>
       </w:pPr>
       <w:r>
         <w:rPr>
           <w:rFonts w:ascii="Times New Roman" w:hAnsi="Times New Roman" w:eastAsia="Times New Roman"/>
           <w:b/>
           <w:i w:val="0"/>
-          <w:sz w:val="26"/>
+          <w:sz w:val="24"/>
         </w:rPr>
         <w:t>1.4. Bảng thông số đặc điểm căn nhà:</w:t>
       </w:r>
@@ -897,16 +975,16 @@
     <w:p>
       <w:pPr>
         <w:keepNext w:val="0"/>
-        <w:spacing w:before="0" w:after="60" w:line="269" w:lineRule="auto"/>
-        <w:ind w:left="0"/>
+        <w:spacing w:before="0" w:after="80" w:line="276" w:lineRule="auto"/>
         <w:jc w:val="center"/>
+        <w:widowControl w:val="1"/>
       </w:pPr>
       <w:r>
         <w:rPr>
           <w:rFonts w:ascii="Times New Roman" w:hAnsi="Times New Roman" w:eastAsia="Times New Roman"/>
           <w:b/>
           <w:i w:val="0"/>
-          <w:sz w:val="26"/>
+          <w:sz w:val="24"/>
         </w:rPr>
         <w:t>{{#propertyFeaturesTable}}</w:t>
       </w:r>
@@ -914,16 +992,16 @@
     <w:p>
       <w:pPr>
         <w:keepNext w:val="0"/>
-        <w:spacing w:before="0" w:after="40" w:line="269" w:lineRule="auto"/>
-        <w:ind w:left="0"/>
+        <w:spacing w:before="0" w:after="80" w:line="276" w:lineRule="auto"/>
         <w:jc w:val="both"/>
+        <w:widowControl w:val="1"/>
       </w:pPr>
       <w:r>
         <w:rPr>
           <w:rFonts w:ascii="Times New Roman" w:hAnsi="Times New Roman" w:eastAsia="Times New Roman"/>
           <w:b w:val="0"/>
           <w:i w:val="0"/>
-          <w:sz w:val="26"/>
+          <w:sz w:val="24"/>
         </w:rPr>
         <w:t>1.5. Mục đích thuê: Dùng để ở và sinh hoạt hợp pháp, không sử dụng vào mục đích vi phạm pháp luật.</w:t>
       </w:r>
@@ -931,9 +1009,9 @@
     <w:p>
       <w:pPr>
         <w:keepNext/>
-        <w:spacing w:before="100" w:after="60" w:line="269" w:lineRule="auto"/>
-        <w:ind w:left="0"/>
-        <w:jc w:val="left"/>
+        <w:spacing w:before="160" w:after="80" w:line="276" w:lineRule="auto"/>
+        <w:jc w:val="both"/>
+        <w:widowControl w:val="1"/>
       </w:pPr>
       <w:r>
         <w:rPr>
@@ -948,16 +1026,16 @@
     <w:p>
       <w:pPr>
         <w:keepNext w:val="0"/>
-        <w:spacing w:before="0" w:after="40" w:line="269" w:lineRule="auto"/>
-        <w:ind w:left="0"/>
+        <w:spacing w:before="0" w:after="80" w:line="276" w:lineRule="auto"/>
         <w:jc w:val="both"/>
+        <w:widowControl w:val="1"/>
       </w:pPr>
       <w:r>
         <w:rPr>
           <w:rFonts w:ascii="Times New Roman" w:hAnsi="Times New Roman" w:eastAsia="Times New Roman"/>
           <w:b w:val="0"/>
           <w:i w:val="0"/>
-          <w:sz w:val="26"/>
+          <w:sz w:val="24"/>
         </w:rPr>
         <w:t xml:space="preserve">2.1. Thời hạn thuê: </w:t>
       </w:r>
@@ -966,7 +1044,7 @@
           <w:rFonts w:ascii="Times New Roman" w:hAnsi="Times New Roman" w:eastAsia="Times New Roman"/>
           <w:b w:val="0"/>
           <w:i w:val="0"/>
-          <w:sz w:val="26"/>
+          <w:sz w:val="24"/>
         </w:rPr>
         <w:t>{{lease.durationText}}</w:t>
       </w:r>
@@ -975,7 +1053,7 @@
           <w:rFonts w:ascii="Times New Roman" w:hAnsi="Times New Roman" w:eastAsia="Times New Roman"/>
           <w:b w:val="0"/>
           <w:i w:val="0"/>
-          <w:sz w:val="26"/>
+          <w:sz w:val="24"/>
         </w:rPr>
         <w:t xml:space="preserve"> (</w:t>
       </w:r>
@@ -984,7 +1062,7 @@
           <w:rFonts w:ascii="Times New Roman" w:hAnsi="Times New Roman" w:eastAsia="Times New Roman"/>
           <w:b w:val="0"/>
           <w:i w:val="0"/>
-          <w:sz w:val="26"/>
+          <w:sz w:val="24"/>
         </w:rPr>
         <w:t>{{lease.durationMonths}}</w:t>
       </w:r>
@@ -993,7 +1071,7 @@
           <w:rFonts w:ascii="Times New Roman" w:hAnsi="Times New Roman" w:eastAsia="Times New Roman"/>
           <w:b w:val="0"/>
           <w:i w:val="0"/>
-          <w:sz w:val="26"/>
+          <w:sz w:val="24"/>
         </w:rPr>
         <w:t xml:space="preserve"> tháng), từ ngày </w:t>
       </w:r>
@@ -1002,7 +1080,7 @@
           <w:rFonts w:ascii="Times New Roman" w:hAnsi="Times New Roman" w:eastAsia="Times New Roman"/>
           <w:b w:val="0"/>
           <w:i w:val="0"/>
-          <w:sz w:val="26"/>
+          <w:sz w:val="24"/>
         </w:rPr>
         <w:t>{{lease.startDateText}}</w:t>
       </w:r>
@@ -1011,7 +1089,7 @@
           <w:rFonts w:ascii="Times New Roman" w:hAnsi="Times New Roman" w:eastAsia="Times New Roman"/>
           <w:b w:val="0"/>
           <w:i w:val="0"/>
-          <w:sz w:val="26"/>
+          <w:sz w:val="24"/>
         </w:rPr>
         <w:t xml:space="preserve"> đến ngày </w:t>
       </w:r>
@@ -1020,7 +1098,7 @@
           <w:rFonts w:ascii="Times New Roman" w:hAnsi="Times New Roman" w:eastAsia="Times New Roman"/>
           <w:b w:val="0"/>
           <w:i w:val="0"/>
-          <w:sz w:val="26"/>
+          <w:sz w:val="24"/>
         </w:rPr>
         <w:t>{{lease.endDateText}}</w:t>
       </w:r>
@@ -1029,7 +1107,7 @@
           <w:rFonts w:ascii="Times New Roman" w:hAnsi="Times New Roman" w:eastAsia="Times New Roman"/>
           <w:b w:val="0"/>
           <w:i w:val="0"/>
-          <w:sz w:val="26"/>
+          <w:sz w:val="24"/>
         </w:rPr>
         <w:t>.</w:t>
       </w:r>
@@ -1037,16 +1115,16 @@
     <w:p>
       <w:pPr>
         <w:keepNext w:val="0"/>
-        <w:spacing w:before="0" w:after="40" w:line="269" w:lineRule="auto"/>
-        <w:ind w:left="0"/>
+        <w:spacing w:before="0" w:after="80" w:line="276" w:lineRule="auto"/>
         <w:jc w:val="both"/>
+        <w:widowControl w:val="1"/>
       </w:pPr>
       <w:r>
         <w:rPr>
           <w:rFonts w:ascii="Times New Roman" w:hAnsi="Times New Roman" w:eastAsia="Times New Roman"/>
           <w:b w:val="0"/>
           <w:i w:val="0"/>
-          <w:sz w:val="26"/>
+          <w:sz w:val="24"/>
         </w:rPr>
         <w:t xml:space="preserve">2.2. Ngày bàn giao: </w:t>
       </w:r>
@@ -1055,7 +1133,7 @@
           <w:rFonts w:ascii="Times New Roman" w:hAnsi="Times New Roman" w:eastAsia="Times New Roman"/>
           <w:b w:val="0"/>
           <w:i w:val="0"/>
-          <w:sz w:val="26"/>
+          <w:sz w:val="24"/>
         </w:rPr>
         <w:t>{{lease.handoverDateText}}</w:t>
       </w:r>
@@ -1064,7 +1142,7 @@
           <w:rFonts w:ascii="Times New Roman" w:hAnsi="Times New Roman" w:eastAsia="Times New Roman"/>
           <w:b w:val="0"/>
           <w:i w:val="0"/>
-          <w:sz w:val="26"/>
+          <w:sz w:val="24"/>
         </w:rPr>
         <w:t>.</w:t>
       </w:r>
@@ -1072,16 +1150,16 @@
     <w:p>
       <w:pPr>
         <w:keepNext w:val="0"/>
-        <w:spacing w:before="0" w:after="40" w:line="269" w:lineRule="auto"/>
-        <w:ind w:left="0"/>
+        <w:spacing w:before="0" w:after="80" w:line="276" w:lineRule="auto"/>
         <w:jc w:val="both"/>
+        <w:widowControl w:val="1"/>
       </w:pPr>
       <w:r>
         <w:rPr>
           <w:rFonts w:ascii="Times New Roman" w:hAnsi="Times New Roman" w:eastAsia="Times New Roman"/>
           <w:b w:val="0"/>
           <w:i w:val="0"/>
-          <w:sz w:val="26"/>
+          <w:sz w:val="24"/>
         </w:rPr>
         <w:t xml:space="preserve">2.3. Bàn giao chỉ số công tơ điện ban đầu: </w:t>
       </w:r>
@@ -1090,7 +1168,7 @@
           <w:rFonts w:ascii="Times New Roman" w:hAnsi="Times New Roman" w:eastAsia="Times New Roman"/>
           <w:b w:val="0"/>
           <w:i w:val="0"/>
-          <w:sz w:val="26"/>
+          <w:sz w:val="24"/>
         </w:rPr>
         <w:t>{{meters.electricityInitial}}</w:t>
       </w:r>
@@ -1099,7 +1177,7 @@
           <w:rFonts w:ascii="Times New Roman" w:hAnsi="Times New Roman" w:eastAsia="Times New Roman"/>
           <w:b w:val="0"/>
           <w:i w:val="0"/>
-          <w:sz w:val="26"/>
+          <w:sz w:val="24"/>
         </w:rPr>
         <w:t xml:space="preserve">; nước ban đầu: </w:t>
       </w:r>
@@ -1108,7 +1186,7 @@
           <w:rFonts w:ascii="Times New Roman" w:hAnsi="Times New Roman" w:eastAsia="Times New Roman"/>
           <w:b w:val="0"/>
           <w:i w:val="0"/>
-          <w:sz w:val="26"/>
+          <w:sz w:val="24"/>
         </w:rPr>
         <w:t>{{meters.waterInitial}}</w:t>
       </w:r>
@@ -1117,7 +1195,7 @@
           <w:rFonts w:ascii="Times New Roman" w:hAnsi="Times New Roman" w:eastAsia="Times New Roman"/>
           <w:b w:val="0"/>
           <w:i w:val="0"/>
-          <w:sz w:val="26"/>
+          <w:sz w:val="24"/>
         </w:rPr>
         <w:t xml:space="preserve"> (nếu chưa có sẽ lập tại Biên bản bàn giao khi nhận nhà).</w:t>
       </w:r>
@@ -1125,9 +1203,9 @@
     <w:p>
       <w:pPr>
         <w:keepNext/>
-        <w:spacing w:before="100" w:after="60" w:line="269" w:lineRule="auto"/>
-        <w:ind w:left="0"/>
-        <w:jc w:val="left"/>
+        <w:spacing w:before="160" w:after="80" w:line="276" w:lineRule="auto"/>
+        <w:jc w:val="both"/>
+        <w:widowControl w:val="1"/>
       </w:pPr>
       <w:r>
         <w:rPr>
@@ -1142,25 +1220,25 @@
     <w:p>
       <w:pPr>
         <w:keepNext w:val="0"/>
-        <w:spacing w:before="0" w:after="40" w:line="269" w:lineRule="auto"/>
-        <w:ind w:left="0"/>
+        <w:spacing w:before="0" w:after="80" w:line="276" w:lineRule="auto"/>
         <w:jc w:val="both"/>
+        <w:widowControl w:val="1"/>
       </w:pPr>
       <w:r>
         <w:rPr>
           <w:rFonts w:ascii="Times New Roman" w:hAnsi="Times New Roman" w:eastAsia="Times New Roman"/>
           <w:b w:val="0"/>
           <w:i w:val="0"/>
-          <w:sz w:val="26"/>
+          <w:sz w:val="24"/>
         </w:rPr>
-        <w:t xml:space="preserve">3.1. Giá thuê nhà: </w:t>
+        <w:t xml:space="preserve">3.1. Giá thuê: </w:t>
       </w:r>
       <w:r>
         <w:rPr>
           <w:rFonts w:ascii="Times New Roman" w:hAnsi="Times New Roman" w:eastAsia="Times New Roman"/>
           <w:b w:val="0"/>
           <w:i w:val="0"/>
-          <w:sz w:val="26"/>
+          <w:sz w:val="24"/>
         </w:rPr>
         <w:t>{{rent.amountNumber}}</w:t>
       </w:r>
@@ -1169,7 +1247,7 @@
           <w:rFonts w:ascii="Times New Roman" w:hAnsi="Times New Roman" w:eastAsia="Times New Roman"/>
           <w:b w:val="0"/>
           <w:i w:val="0"/>
-          <w:sz w:val="26"/>
+          <w:sz w:val="24"/>
         </w:rPr>
         <w:t xml:space="preserve"> VNĐ/tháng (Bằng chữ: </w:t>
       </w:r>
@@ -1178,7 +1256,7 @@
           <w:rFonts w:ascii="Times New Roman" w:hAnsi="Times New Roman" w:eastAsia="Times New Roman"/>
           <w:b w:val="0"/>
           <w:i w:val="0"/>
-          <w:sz w:val="26"/>
+          <w:sz w:val="24"/>
         </w:rPr>
         <w:t>{{rent.amountWords}}</w:t>
       </w:r>
@@ -1187,7 +1265,7 @@
           <w:rFonts w:ascii="Times New Roman" w:hAnsi="Times New Roman" w:eastAsia="Times New Roman"/>
           <w:b w:val="0"/>
           <w:i w:val="0"/>
-          <w:sz w:val="26"/>
+          <w:sz w:val="24"/>
         </w:rPr>
         <w:t>).</w:t>
       </w:r>
@@ -1195,16 +1273,16 @@
     <w:p>
       <w:pPr>
         <w:keepNext w:val="0"/>
-        <w:spacing w:before="0" w:after="40" w:line="269" w:lineRule="auto"/>
-        <w:ind w:left="0"/>
+        <w:spacing w:before="0" w:after="80" w:line="276" w:lineRule="auto"/>
         <w:jc w:val="both"/>
+        <w:widowControl w:val="1"/>
       </w:pPr>
       <w:r>
         <w:rPr>
           <w:rFonts w:ascii="Times New Roman" w:hAnsi="Times New Roman" w:eastAsia="Times New Roman"/>
           <w:b w:val="0"/>
           <w:i w:val="0"/>
-          <w:sz w:val="26"/>
+          <w:sz w:val="24"/>
         </w:rPr>
         <w:t xml:space="preserve">3.2. Chu kỳ thanh toán: </w:t>
       </w:r>
@@ -1213,7 +1291,7 @@
           <w:rFonts w:ascii="Times New Roman" w:hAnsi="Times New Roman" w:eastAsia="Times New Roman"/>
           <w:b w:val="0"/>
           <w:i w:val="0"/>
-          <w:sz w:val="26"/>
+          <w:sz w:val="24"/>
         </w:rPr>
         <w:t>{{rent.paymentCycle}}</w:t>
       </w:r>
@@ -1222,7 +1300,7 @@
           <w:rFonts w:ascii="Times New Roman" w:hAnsi="Times New Roman" w:eastAsia="Times New Roman"/>
           <w:b w:val="0"/>
           <w:i w:val="0"/>
-          <w:sz w:val="26"/>
+          <w:sz w:val="24"/>
         </w:rPr>
         <w:t xml:space="preserve">; Hạn thanh toán định kỳ: </w:t>
       </w:r>
@@ -1231,7 +1309,7 @@
           <w:rFonts w:ascii="Times New Roman" w:hAnsi="Times New Roman" w:eastAsia="Times New Roman"/>
           <w:b w:val="0"/>
           <w:i w:val="0"/>
-          <w:sz w:val="26"/>
+          <w:sz w:val="24"/>
         </w:rPr>
         <w:t>{{rent.paymentDueDay}}</w:t>
       </w:r>
@@ -1240,7 +1318,7 @@
           <w:rFonts w:ascii="Times New Roman" w:hAnsi="Times New Roman" w:eastAsia="Times New Roman"/>
           <w:b w:val="0"/>
           <w:i w:val="0"/>
-          <w:sz w:val="26"/>
+          <w:sz w:val="24"/>
         </w:rPr>
         <w:t>.</w:t>
       </w:r>
@@ -1248,16 +1326,16 @@
     <w:p>
       <w:pPr>
         <w:keepNext w:val="0"/>
-        <w:spacing w:before="0" w:after="40" w:line="269" w:lineRule="auto"/>
-        <w:ind w:left="0"/>
+        <w:spacing w:before="0" w:after="80" w:line="276" w:lineRule="auto"/>
         <w:jc w:val="both"/>
+        <w:widowControl w:val="1"/>
       </w:pPr>
       <w:r>
         <w:rPr>
           <w:rFonts w:ascii="Times New Roman" w:hAnsi="Times New Roman" w:eastAsia="Times New Roman"/>
           <w:b w:val="0"/>
           <w:i w:val="0"/>
-          <w:sz w:val="26"/>
+          <w:sz w:val="24"/>
         </w:rPr>
         <w:t xml:space="preserve">3.3. Phương thức thanh toán: </w:t>
       </w:r>
@@ -1266,7 +1344,7 @@
           <w:rFonts w:ascii="Times New Roman" w:hAnsi="Times New Roman" w:eastAsia="Times New Roman"/>
           <w:b w:val="0"/>
           <w:i w:val="0"/>
-          <w:sz w:val="26"/>
+          <w:sz w:val="24"/>
         </w:rPr>
         <w:t>{{rent.paymentMethod}}</w:t>
       </w:r>
@@ -1275,7 +1353,7 @@
           <w:rFonts w:ascii="Times New Roman" w:hAnsi="Times New Roman" w:eastAsia="Times New Roman"/>
           <w:b w:val="0"/>
           <w:i w:val="0"/>
-          <w:sz w:val="26"/>
+          <w:sz w:val="24"/>
         </w:rPr>
         <w:t>.</w:t>
       </w:r>
@@ -1283,16 +1361,16 @@
     <w:p>
       <w:pPr>
         <w:keepNext w:val="0"/>
-        <w:spacing w:before="0" w:after="40" w:line="269" w:lineRule="auto"/>
-        <w:ind w:left="0"/>
+        <w:spacing w:before="0" w:after="80" w:line="276" w:lineRule="auto"/>
         <w:jc w:val="both"/>
+        <w:widowControl w:val="1"/>
       </w:pPr>
       <w:r>
         <w:rPr>
           <w:rFonts w:ascii="Times New Roman" w:hAnsi="Times New Roman" w:eastAsia="Times New Roman"/>
           <w:b w:val="0"/>
           <w:i w:val="0"/>
-          <w:sz w:val="26"/>
+          <w:sz w:val="24"/>
         </w:rPr>
         <w:t xml:space="preserve">3.4. Tiền đặt cọc: </w:t>
       </w:r>
@@ -1301,7 +1379,7 @@
           <w:rFonts w:ascii="Times New Roman" w:hAnsi="Times New Roman" w:eastAsia="Times New Roman"/>
           <w:b w:val="0"/>
           <w:i w:val="0"/>
-          <w:sz w:val="26"/>
+          <w:sz w:val="24"/>
         </w:rPr>
         <w:t>{{deposit.amountNumber}}</w:t>
       </w:r>
@@ -1310,7 +1388,7 @@
           <w:rFonts w:ascii="Times New Roman" w:hAnsi="Times New Roman" w:eastAsia="Times New Roman"/>
           <w:b w:val="0"/>
           <w:i w:val="0"/>
-          <w:sz w:val="26"/>
+          <w:sz w:val="24"/>
         </w:rPr>
         <w:t xml:space="preserve"> VNĐ (Bằng chữ: </w:t>
       </w:r>
@@ -1319,7 +1397,7 @@
           <w:rFonts w:ascii="Times New Roman" w:hAnsi="Times New Roman" w:eastAsia="Times New Roman"/>
           <w:b w:val="0"/>
           <w:i w:val="0"/>
-          <w:sz w:val="26"/>
+          <w:sz w:val="24"/>
         </w:rPr>
         <w:t>{{deposit.amountWords}}</w:t>
       </w:r>
@@ -1328,7 +1406,7 @@
           <w:rFonts w:ascii="Times New Roman" w:hAnsi="Times New Roman" w:eastAsia="Times New Roman"/>
           <w:b w:val="0"/>
           <w:i w:val="0"/>
-          <w:sz w:val="26"/>
+          <w:sz w:val="24"/>
         </w:rPr>
         <w:t>).</w:t>
       </w:r>
@@ -1336,16 +1414,16 @@
     <w:p>
       <w:pPr>
         <w:keepNext w:val="0"/>
-        <w:spacing w:before="0" w:after="40" w:line="269" w:lineRule="auto"/>
-        <w:ind w:left="0"/>
+        <w:spacing w:before="0" w:after="80" w:line="276" w:lineRule="auto"/>
         <w:jc w:val="both"/>
+        <w:widowControl w:val="1"/>
       </w:pPr>
       <w:r>
         <w:rPr>
           <w:rFonts w:ascii="Times New Roman" w:hAnsi="Times New Roman" w:eastAsia="Times New Roman"/>
           <w:b w:val="0"/>
           <w:i w:val="0"/>
-          <w:sz w:val="26"/>
+          <w:sz w:val="24"/>
         </w:rPr>
         <w:t xml:space="preserve">3.5. Điều kiện hoàn trả/khấu trừ cọc: </w:t>
       </w:r>
@@ -1354,7 +1432,7 @@
           <w:rFonts w:ascii="Times New Roman" w:hAnsi="Times New Roman" w:eastAsia="Times New Roman"/>
           <w:b w:val="0"/>
           <w:i w:val="0"/>
-          <w:sz w:val="26"/>
+          <w:sz w:val="24"/>
         </w:rPr>
         <w:t>{{deposit.description}}</w:t>
       </w:r>
@@ -1363,7 +1441,7 @@
           <w:rFonts w:ascii="Times New Roman" w:hAnsi="Times New Roman" w:eastAsia="Times New Roman"/>
           <w:b w:val="0"/>
           <w:i w:val="0"/>
-          <w:sz w:val="26"/>
+          <w:sz w:val="24"/>
         </w:rPr>
         <w:t>.</w:t>
       </w:r>
@@ -1371,16 +1449,16 @@
     <w:p>
       <w:pPr>
         <w:keepNext/>
-        <w:spacing w:before="0" w:after="40" w:line="269" w:lineRule="auto"/>
-        <w:ind w:left="0"/>
-        <w:jc w:val="left"/>
+        <w:spacing w:before="0" w:after="80" w:line="276" w:lineRule="auto"/>
+        <w:jc w:val="both"/>
+        <w:widowControl w:val="1"/>
       </w:pPr>
       <w:r>
         <w:rPr>
           <w:rFonts w:ascii="Times New Roman" w:hAnsi="Times New Roman" w:eastAsia="Times New Roman"/>
-          <w:b w:val="0"/>
+          <w:b/>
           <w:i w:val="0"/>
-          <w:sz w:val="26"/>
+          <w:sz w:val="24"/>
         </w:rPr>
         <w:t>3.6. Quy định chi tiết về chuyển khoản trực tiếp và vai trò HomeSpace:</w:t>
       </w:r>
@@ -1388,169 +1466,159 @@
     <w:p>
       <w:pPr>
         <w:keepNext w:val="0"/>
-        <w:spacing w:before="0" w:after="40" w:line="269" w:lineRule="auto"/>
-        <w:ind w:left="198"/>
+        <w:spacing w:before="0" w:after="80" w:line="276" w:lineRule="auto"/>
+        <w:ind w:left="255" w:hanging="142"/>
         <w:jc w:val="both"/>
+        <w:widowControl w:val="1"/>
       </w:pPr>
       <w:r>
         <w:rPr>
           <w:rFonts w:ascii="Times New Roman" w:hAnsi="Times New Roman" w:eastAsia="Times New Roman"/>
           <w:b w:val="0"/>
           <w:i w:val="0"/>
-          <w:sz w:val="26"/>
+          <w:sz w:val="24"/>
         </w:rPr>
-        <w:t>3.6.1. Bên B thanh toán tiền thuê, tiền đặt cọc và các khoản phải trả khác bằng hình thức chuyển khoản trực tiếp vào tài khoản do Bên A chỉ định trong Hợp đồng này hoặc tài khoản thay thế được hai bên xác nhận bằng văn bản hoặc thông điệp dữ liệu.</w:t>
+        <w:t>+ Bên B thanh toán tiền thuê, tiền đặt cọc và các khoản phải trả khác bằng hình thức chuyển khoản trực tiếp vào tài khoản do Bên A chỉ định trong Hợp đồng này hoặc tài khoản thay thế được hai bên xác nhận bằng văn bản hoặc thông điệp dữ liệu.</w:t>
       </w:r>
     </w:p>
     <w:p>
       <w:pPr>
         <w:keepNext w:val="0"/>
-        <w:spacing w:before="0" w:after="40" w:line="269" w:lineRule="auto"/>
-        <w:ind w:left="198"/>
+        <w:spacing w:before="0" w:after="80" w:line="276" w:lineRule="auto"/>
+        <w:ind w:left="255" w:hanging="142"/>
         <w:jc w:val="both"/>
+        <w:widowControl w:val="1"/>
       </w:pPr>
       <w:r>
         <w:rPr>
           <w:rFonts w:ascii="Times New Roman" w:hAnsi="Times New Roman" w:eastAsia="Times New Roman"/>
           <w:b w:val="0"/>
           <w:i w:val="0"/>
-          <w:sz w:val="26"/>
+          <w:sz w:val="24"/>
         </w:rPr>
-        <w:t>3.6.2. HomeSpace cung cấp công cụ tính toán khoản phải trả, tạo thông tin VietQR, lưu trữ yêu cầu thanh toán và ghi nhận trạng thái do các bên khai báo. HomeSpace không nhận tiền, không giữ tiền, không chuyển tiền thay các bên và không thay thế ngân hàng xác nhận việc ghi Có hoặc ghi Nợ trên tài khoản.</w:t>
+        <w:t>+ HomeSpace cung cấp công cụ tính toán khoản phải trả, tạo thông tin VietQR, lưu trữ yêu cầu thanh toán và ghi nhận trạng thái do các bên khai báo. HomeSpace không nhận tiền, không giữ tiền, không chuyển tiền thay các bên và không thay thế ngân hàng xác nhận việc ghi Có hoặc ghi Nợ trên tài khoản.</w:t>
       </w:r>
     </w:p>
     <w:p>
       <w:pPr>
         <w:keepNext w:val="0"/>
-        <w:spacing w:before="0" w:after="40" w:line="269" w:lineRule="auto"/>
-        <w:ind w:left="198"/>
+        <w:spacing w:before="0" w:after="80" w:line="276" w:lineRule="auto"/>
+        <w:ind w:left="255" w:hanging="142"/>
         <w:jc w:val="both"/>
+        <w:widowControl w:val="1"/>
       </w:pPr>
       <w:r>
         <w:rPr>
           <w:rFonts w:ascii="Times New Roman" w:hAnsi="Times New Roman" w:eastAsia="Times New Roman"/>
           <w:b w:val="0"/>
           <w:i w:val="0"/>
-          <w:sz w:val="26"/>
+          <w:sz w:val="24"/>
         </w:rPr>
-        <w:t>3.6.3. Một khoản thanh toán được ghi nhận hoàn tất trên HomeSpace sau khi Bên B khai báo đã thực hiện chuyển khoản và Bên A xác nhận đã nhận đủ số tiền tương ứng. Việc ghi nhận này được lập trên cơ sở xác nhận của các bên và không phải là xác nhận giao dịch do ngân hàng phát hành.</w:t>
+        <w:t>+ Một khoản thanh toán được ghi nhận hoàn tất trên HomeSpace sau khi Bên B khai báo đã thực hiện chuyển khoản và Bên A xác nhận đã nhận đủ số tiền tương ứng. Việc ghi nhận này được lập trên cơ sở xác nhận của các bên và không phải là xác nhận giao dịch do ngân hàng phát hành.</w:t>
       </w:r>
     </w:p>
     <w:p>
       <w:pPr>
         <w:keepNext w:val="0"/>
-        <w:spacing w:before="0" w:after="40" w:line="269" w:lineRule="auto"/>
-        <w:ind w:left="198"/>
+        <w:spacing w:before="0" w:after="80" w:line="276" w:lineRule="auto"/>
+        <w:ind w:left="255" w:hanging="142"/>
         <w:jc w:val="both"/>
+        <w:widowControl w:val="1"/>
       </w:pPr>
       <w:r>
         <w:rPr>
           <w:rFonts w:ascii="Times New Roman" w:hAnsi="Times New Roman" w:eastAsia="Times New Roman"/>
           <w:b w:val="0"/>
           <w:i w:val="0"/>
-          <w:sz w:val="26"/>
+          <w:sz w:val="24"/>
         </w:rPr>
-        <w:t>3.6.4. Bên B có trách nhiệm kiểm tra tên chủ tài khoản, số tài khoản, ngân hàng thụ hưởng, số tiền và nội dung chuyển khoản trước khi thực hiện. Bên A có trách nhiệm kiểm tra tài khoản nhận và xác nhận trung thực trạng thái nhận tiền.</w:t>
+        <w:t>+ Bên B có trách nhiệm kiểm tra tên chủ tài khoản, số tài khoản, ngân hàng thụ hưởng, số tiền và nội dung chuyển khoản trước khi thực hiện. Bên A có trách nhiệm kiểm tra tài khoản nhận và xác nhận trung thực trạng thái nhận tiền.</w:t>
       </w:r>
     </w:p>
     <w:p>
       <w:pPr>
         <w:keepNext w:val="0"/>
-        <w:spacing w:before="0" w:after="40" w:line="269" w:lineRule="auto"/>
-        <w:ind w:left="198"/>
+        <w:spacing w:before="0" w:after="80" w:line="276" w:lineRule="auto"/>
+        <w:ind w:left="255" w:hanging="142"/>
         <w:jc w:val="both"/>
+        <w:widowControl w:val="1"/>
       </w:pPr>
       <w:r>
         <w:rPr>
           <w:rFonts w:ascii="Times New Roman" w:hAnsi="Times New Roman" w:eastAsia="Times New Roman"/>
           <w:b w:val="0"/>
           <w:i w:val="0"/>
-          <w:sz w:val="26"/>
+          <w:sz w:val="24"/>
         </w:rPr>
-        <w:t>3.6.5. Trường hợp thông tin khai báo giữa các bên không thống nhất, khoản thanh toán được chuyển sang trạng thái chờ đối soát. Các bên có trách nhiệm cung cấp chứng từ ngân hàng và phối hợp xác minh; HomeSpace chỉ lưu trữ thông tin, chứng từ và lịch sử xác nhận do các bên cung cấp.</w:t>
+        <w:t>+ Trường hợp thông tin khai báo giữa các bên không thống nhất, khoản thanh toán được chuyển sang trạng thái chờ đối soát. Các bên có trách nhiệm cung cấp chứng từ ngân hàng và phối hợp xác minh; HomeSpace chỉ lưu trữ thông tin, chứng từ và lịch sử xác nhận do các bên cung cấp.</w:t>
       </w:r>
     </w:p>
     <w:p>
       <w:pPr>
         <w:keepNext w:val="0"/>
-        <w:spacing w:before="0" w:after="40" w:line="269" w:lineRule="auto"/>
-        <w:ind w:left="198"/>
+        <w:spacing w:before="0" w:after="80" w:line="276" w:lineRule="auto"/>
+        <w:ind w:left="255" w:hanging="142"/>
         <w:jc w:val="both"/>
+        <w:widowControl w:val="1"/>
       </w:pPr>
       <w:r>
         <w:rPr>
           <w:rFonts w:ascii="Times New Roman" w:hAnsi="Times New Roman" w:eastAsia="Times New Roman"/>
           <w:b w:val="0"/>
           <w:i w:val="0"/>
-          <w:sz w:val="26"/>
+          <w:sz w:val="24"/>
         </w:rPr>
-        <w:t>3.6.6. Mọi thay đổi tài khoản nhận thanh toán hoặc tài khoản nhận hoàn trả chỉ có hiệu lực đối với nghĩa vụ phát sinh sau khi bên còn lại đã nhận được và xác nhận thông báo thay đổi. Việc thay đổi tài khoản trên hồ sơ HomeSpace không tự động sửa đổi phiên bản hợp đồng đang có hiệu lực.</w:t>
+        <w:t>+ Mọi thay đổi tài khoản nhận thanh toán hoặc tài khoản nhận hoàn trả chỉ có hiệu lực đối với nghĩa vụ phát sinh sau khi bên còn lại đã nhận được và xác nhận thông báo thay đổi. Việc thay đổi tài khoản trên hồ sơ HomeSpace không tự động sửa đổi phiên bản hợp đồng đang có hiệu lực.</w:t>
       </w:r>
     </w:p>
     <w:p>
       <w:pPr>
         <w:keepNext w:val="0"/>
-        <w:spacing w:before="0" w:after="40" w:line="269" w:lineRule="auto"/>
-        <w:ind w:left="198"/>
+        <w:spacing w:before="0" w:after="80" w:line="276" w:lineRule="auto"/>
+        <w:ind w:left="255" w:hanging="142"/>
         <w:jc w:val="both"/>
+        <w:widowControl w:val="1"/>
       </w:pPr>
       <w:r>
         <w:rPr>
           <w:rFonts w:ascii="Times New Roman" w:hAnsi="Times New Roman" w:eastAsia="Times New Roman"/>
           <w:b w:val="0"/>
           <w:i w:val="0"/>
-          <w:sz w:val="26"/>
+          <w:sz w:val="24"/>
         </w:rPr>
-        <w:t>3.6.7. Khi chấm dứt hoặc hết hạn hợp đồng, sau khi hai bên hoàn tất bàn giao và quyết toán, Bên A chuyển khoản số tiền cọc còn phải hoàn trực tiếp vào tài khoản nhận hoàn trả của Bên B ghi trong Hợp đồng hoặc tài khoản khác được hai bên xác nhận. Việc hoàn cọc được ghi nhận hoàn tất sau khi Bên A khai báo đã chuyển và Bên B xác nhận đã nhận đủ tiền.</w:t>
+        <w:t>+ Khi chấm dứt hoặc hết hạn hợp đồng, sau khi hai bên hoàn tất bàn giao và quyết toán, Bên A chuyển khoản số tiền cọc còn phải hoàn trực tiếp vào tài khoản nhận hoàn trả của Bên B ghi trong Hợp đồng hoặc tài khoản khác được hai bên xác nhận. Việc hoàn cọc được ghi nhận hoàn tất sau khi Bên A khai báo đã chuyển và Bên B xác nhận đã nhận đủ tiền.</w:t>
       </w:r>
     </w:p>
     <w:p>
       <w:pPr>
         <w:keepNext/>
-        <w:spacing w:before="0" w:after="40" w:line="269" w:lineRule="auto"/>
-        <w:ind w:left="0"/>
-        <w:jc w:val="left"/>
+        <w:spacing w:before="0" w:after="40" w:line="276" w:lineRule="auto"/>
+        <w:jc w:val="both"/>
+        <w:widowControl w:val="1"/>
       </w:pPr>
       <w:r>
         <w:rPr>
           <w:rFonts w:ascii="Times New Roman" w:hAnsi="Times New Roman" w:eastAsia="Times New Roman"/>
-          <w:b w:val="0"/>
+          <w:b/>
           <w:i w:val="0"/>
-          <w:sz w:val="26"/>
+          <w:sz w:val="24"/>
         </w:rPr>
         <w:t>3.7. Bảng ghi nhận thanh toán ban đầu đã được hai bên xác nhận:</w:t>
       </w:r>
     </w:p>
     <w:p>
       <w:pPr>
-        <w:keepNext/>
-        <w:spacing w:before="0" w:after="20" w:line="269" w:lineRule="auto"/>
-        <w:ind w:left="0"/>
-        <w:jc w:val="both"/>
+        <w:keepNext w:val="0"/>
+        <w:spacing w:before="0" w:after="80" w:line="276" w:lineRule="auto"/>
+        <w:jc w:val="center"/>
+        <w:widowControl w:val="1"/>
       </w:pPr>
       <w:r>
         <w:rPr>
           <w:rFonts w:ascii="Times New Roman" w:hAnsi="Times New Roman" w:eastAsia="Times New Roman"/>
           <w:b/>
           <w:i w:val="0"/>
-          <w:sz w:val="26"/>
-        </w:rPr>
-        <w:t>Thông tin thanh toán ban đầu:</w:t>
-      </w:r>
-    </w:p>
-    <w:p>
-      <w:pPr>
-        <w:keepNext w:val="0"/>
-        <w:spacing w:before="0" w:after="60" w:line="269" w:lineRule="auto"/>
-        <w:ind w:left="0"/>
-        <w:jc w:val="center"/>
-      </w:pPr>
-      <w:r>
-        <w:rPr>
-          <w:rFonts w:ascii="Times New Roman" w:hAnsi="Times New Roman" w:eastAsia="Times New Roman"/>
-          <w:b/>
-          <w:i w:val="0"/>
-          <w:sz w:val="26"/>
+          <w:sz w:val="24"/>
         </w:rPr>
         <w:t>{{#initialPaymentTable}}</w:t>
       </w:r>
@@ -1558,25 +1626,25 @@
     <w:p>
       <w:pPr>
         <w:keepNext w:val="0"/>
-        <w:spacing w:before="0" w:after="40" w:line="269" w:lineRule="auto"/>
-        <w:ind w:left="0"/>
+        <w:spacing w:before="0" w:after="80" w:line="276" w:lineRule="auto"/>
         <w:jc w:val="both"/>
+        <w:widowControl w:val="1"/>
       </w:pPr>
       <w:r>
         <w:rPr>
           <w:rFonts w:ascii="Times New Roman" w:hAnsi="Times New Roman" w:eastAsia="Times New Roman"/>
           <w:b w:val="0"/>
           <w:i w:val="0"/>
-          <w:sz w:val="26"/>
+          <w:sz w:val="24"/>
         </w:rPr>
-        <w:t xml:space="preserve">Mã nội dung chuyển khoản: </w:t>
+        <w:t xml:space="preserve">3.8. Mã nội dung chuyển khoản: </w:t>
       </w:r>
       <w:r>
         <w:rPr>
           <w:rFonts w:ascii="Times New Roman" w:hAnsi="Times New Roman" w:eastAsia="Times New Roman"/>
           <w:b w:val="0"/>
           <w:i w:val="0"/>
-          <w:sz w:val="26"/>
+          <w:sz w:val="24"/>
         </w:rPr>
         <w:t>{{payment.initial.transferReference}}</w:t>
       </w:r>
@@ -1585,16 +1653,16 @@
           <w:rFonts w:ascii="Times New Roman" w:hAnsi="Times New Roman" w:eastAsia="Times New Roman"/>
           <w:b w:val="0"/>
           <w:i w:val="0"/>
-          <w:sz w:val="26"/>
+          <w:sz w:val="24"/>
         </w:rPr>
-        <w:t xml:space="preserve">; Mã tham chiếu ngân hàng: </w:t>
+        <w:t xml:space="preserve">; Mã tham chiếu giao dịch ngân hàng: </w:t>
       </w:r>
       <w:r>
         <w:rPr>
           <w:rFonts w:ascii="Times New Roman" w:hAnsi="Times New Roman" w:eastAsia="Times New Roman"/>
           <w:b w:val="0"/>
           <w:i w:val="0"/>
-          <w:sz w:val="26"/>
+          <w:sz w:val="24"/>
         </w:rPr>
         <w:t>{{payment.initial.bankTransactionReference}}</w:t>
       </w:r>
@@ -1603,7 +1671,7 @@
           <w:rFonts w:ascii="Times New Roman" w:hAnsi="Times New Roman" w:eastAsia="Times New Roman"/>
           <w:b w:val="0"/>
           <w:i w:val="0"/>
-          <w:sz w:val="26"/>
+          <w:sz w:val="24"/>
         </w:rPr>
         <w:t xml:space="preserve">; Bên B khai báo chuyển: </w:t>
       </w:r>
@@ -1612,7 +1680,7 @@
           <w:rFonts w:ascii="Times New Roman" w:hAnsi="Times New Roman" w:eastAsia="Times New Roman"/>
           <w:b w:val="0"/>
           <w:i w:val="0"/>
-          <w:sz w:val="26"/>
+          <w:sz w:val="24"/>
         </w:rPr>
         <w:t>{{payment.initial.payerReportedAt}}</w:t>
       </w:r>
@@ -1621,7 +1689,7 @@
           <w:rFonts w:ascii="Times New Roman" w:hAnsi="Times New Roman" w:eastAsia="Times New Roman"/>
           <w:b w:val="0"/>
           <w:i w:val="0"/>
-          <w:sz w:val="26"/>
+          <w:sz w:val="24"/>
         </w:rPr>
         <w:t xml:space="preserve">; Bên A xác nhận nhận: </w:t>
       </w:r>
@@ -1630,7 +1698,7 @@
           <w:rFonts w:ascii="Times New Roman" w:hAnsi="Times New Roman" w:eastAsia="Times New Roman"/>
           <w:b w:val="0"/>
           <w:i w:val="0"/>
-          <w:sz w:val="26"/>
+          <w:sz w:val="24"/>
         </w:rPr>
         <w:t>{{payment.initial.payeeConfirmedAt}}</w:t>
       </w:r>
@@ -1639,7 +1707,7 @@
           <w:rFonts w:ascii="Times New Roman" w:hAnsi="Times New Roman" w:eastAsia="Times New Roman"/>
           <w:b w:val="0"/>
           <w:i w:val="0"/>
-          <w:sz w:val="26"/>
+          <w:sz w:val="24"/>
         </w:rPr>
         <w:t xml:space="preserve">; Hoàn tất xác nhận hai chiều: </w:t>
       </w:r>
@@ -1648,7 +1716,7 @@
           <w:rFonts w:ascii="Times New Roman" w:hAnsi="Times New Roman" w:eastAsia="Times New Roman"/>
           <w:b w:val="0"/>
           <w:i w:val="0"/>
-          <w:sz w:val="26"/>
+          <w:sz w:val="24"/>
         </w:rPr>
         <w:t>{{payment.initial.confirmedAt}}</w:t>
       </w:r>
@@ -1657,7 +1725,7 @@
           <w:rFonts w:ascii="Times New Roman" w:hAnsi="Times New Roman" w:eastAsia="Times New Roman"/>
           <w:b w:val="0"/>
           <w:i w:val="0"/>
-          <w:sz w:val="26"/>
+          <w:sz w:val="24"/>
         </w:rPr>
         <w:t xml:space="preserve">; Trạng thái xác nhận: </w:t>
       </w:r>
@@ -1666,7 +1734,7 @@
           <w:rFonts w:ascii="Times New Roman" w:hAnsi="Times New Roman" w:eastAsia="Times New Roman"/>
           <w:b w:val="0"/>
           <w:i w:val="0"/>
-          <w:sz w:val="26"/>
+          <w:sz w:val="24"/>
         </w:rPr>
         <w:t>{{payment.initial.status}}</w:t>
       </w:r>
@@ -1675,7 +1743,7 @@
           <w:rFonts w:ascii="Times New Roman" w:hAnsi="Times New Roman" w:eastAsia="Times New Roman"/>
           <w:b w:val="0"/>
           <w:i w:val="0"/>
-          <w:sz w:val="26"/>
+          <w:sz w:val="24"/>
         </w:rPr>
         <w:t xml:space="preserve">; Tổng số tiền ban đầu: </w:t>
       </w:r>
@@ -1684,7 +1752,7 @@
           <w:rFonts w:ascii="Times New Roman" w:hAnsi="Times New Roman" w:eastAsia="Times New Roman"/>
           <w:b w:val="0"/>
           <w:i w:val="0"/>
-          <w:sz w:val="26"/>
+          <w:sz w:val="24"/>
         </w:rPr>
         <w:t>{{payment.initial.totalAmount}}</w:t>
       </w:r>
@@ -1693,7 +1761,7 @@
           <w:rFonts w:ascii="Times New Roman" w:hAnsi="Times New Roman" w:eastAsia="Times New Roman"/>
           <w:b w:val="0"/>
           <w:i w:val="0"/>
-          <w:sz w:val="26"/>
+          <w:sz w:val="24"/>
         </w:rPr>
         <w:t xml:space="preserve">; Thời điểm hoàn tất (tương thích V2): </w:t>
       </w:r>
@@ -1702,7 +1770,7 @@
           <w:rFonts w:ascii="Times New Roman" w:hAnsi="Times New Roman" w:eastAsia="Times New Roman"/>
           <w:b w:val="0"/>
           <w:i w:val="0"/>
-          <w:sz w:val="26"/>
+          <w:sz w:val="24"/>
         </w:rPr>
         <w:t>{{payment.initial.paidAt}}</w:t>
       </w:r>
@@ -1711,7 +1779,7 @@
           <w:rFonts w:ascii="Times New Roman" w:hAnsi="Times New Roman" w:eastAsia="Times New Roman"/>
           <w:b w:val="0"/>
           <w:i w:val="0"/>
-          <w:sz w:val="26"/>
+          <w:sz w:val="24"/>
         </w:rPr>
         <w:t xml:space="preserve">; Mã giao dịch đối chiếu (tương thích V2): </w:t>
       </w:r>
@@ -1720,7 +1788,7 @@
           <w:rFonts w:ascii="Times New Roman" w:hAnsi="Times New Roman" w:eastAsia="Times New Roman"/>
           <w:b w:val="0"/>
           <w:i w:val="0"/>
-          <w:sz w:val="26"/>
+          <w:sz w:val="24"/>
         </w:rPr>
         <w:t>{{payment.initial.transactionCode}}</w:t>
       </w:r>
@@ -1729,7 +1797,7 @@
           <w:rFonts w:ascii="Times New Roman" w:hAnsi="Times New Roman" w:eastAsia="Times New Roman"/>
           <w:b w:val="0"/>
           <w:i w:val="0"/>
-          <w:sz w:val="26"/>
+          <w:sz w:val="24"/>
         </w:rPr>
         <w:t>.</w:t>
       </w:r>
@@ -1737,9 +1805,9 @@
     <w:p>
       <w:pPr>
         <w:keepNext/>
-        <w:spacing w:before="100" w:after="60" w:line="269" w:lineRule="auto"/>
-        <w:ind w:left="0"/>
-        <w:jc w:val="left"/>
+        <w:spacing w:before="160" w:after="80" w:line="276" w:lineRule="auto"/>
+        <w:jc w:val="both"/>
+        <w:widowControl w:val="1"/>
       </w:pPr>
       <w:r>
         <w:rPr>
@@ -1754,16 +1822,16 @@
     <w:p>
       <w:pPr>
         <w:keepNext/>
-        <w:spacing w:before="0" w:after="20" w:line="269" w:lineRule="auto"/>
-        <w:ind w:left="0"/>
+        <w:spacing w:before="0" w:after="40" w:line="276" w:lineRule="auto"/>
         <w:jc w:val="both"/>
+        <w:widowControl w:val="1"/>
       </w:pPr>
       <w:r>
         <w:rPr>
           <w:rFonts w:ascii="Times New Roman" w:hAnsi="Times New Roman" w:eastAsia="Times New Roman"/>
           <w:b/>
           <w:i w:val="0"/>
-          <w:sz w:val="26"/>
+          <w:sz w:val="24"/>
         </w:rPr>
         <w:t>4.1. Bảng chi phí định kỳ và dịch vụ đi kèm:</w:t>
       </w:r>
@@ -1771,16 +1839,16 @@
     <w:p>
       <w:pPr>
         <w:keepNext w:val="0"/>
-        <w:spacing w:before="0" w:after="60" w:line="269" w:lineRule="auto"/>
-        <w:ind w:left="0"/>
+        <w:spacing w:before="0" w:after="80" w:line="276" w:lineRule="auto"/>
         <w:jc w:val="center"/>
+        <w:widowControl w:val="1"/>
       </w:pPr>
       <w:r>
         <w:rPr>
           <w:rFonts w:ascii="Times New Roman" w:hAnsi="Times New Roman" w:eastAsia="Times New Roman"/>
           <w:b/>
           <w:i w:val="0"/>
-          <w:sz w:val="26"/>
+          <w:sz w:val="24"/>
         </w:rPr>
         <w:t>{{#chargesTable}}</w:t>
       </w:r>
@@ -1788,16 +1856,16 @@
     <w:p>
       <w:pPr>
         <w:keepNext/>
-        <w:spacing w:before="0" w:after="20" w:line="269" w:lineRule="auto"/>
-        <w:ind w:left="0"/>
+        <w:spacing w:before="0" w:after="40" w:line="276" w:lineRule="auto"/>
         <w:jc w:val="both"/>
+        <w:widowControl w:val="1"/>
       </w:pPr>
       <w:r>
         <w:rPr>
           <w:rFonts w:ascii="Times New Roman" w:hAnsi="Times New Roman" w:eastAsia="Times New Roman"/>
           <w:b/>
           <w:i w:val="0"/>
-          <w:sz w:val="26"/>
+          <w:sz w:val="24"/>
         </w:rPr>
         <w:t>4.2. Bảng tiện ích và quyền sử dụng dịch vụ:</w:t>
       </w:r>
@@ -1805,16 +1873,16 @@
     <w:p>
       <w:pPr>
         <w:keepNext w:val="0"/>
-        <w:spacing w:before="0" w:after="60" w:line="269" w:lineRule="auto"/>
-        <w:ind w:left="0"/>
+        <w:spacing w:before="0" w:after="80" w:line="276" w:lineRule="auto"/>
         <w:jc w:val="center"/>
+        <w:widowControl w:val="1"/>
       </w:pPr>
       <w:r>
         <w:rPr>
           <w:rFonts w:ascii="Times New Roman" w:hAnsi="Times New Roman" w:eastAsia="Times New Roman"/>
           <w:b/>
           <w:i w:val="0"/>
-          <w:sz w:val="26"/>
+          <w:sz w:val="24"/>
         </w:rPr>
         <w:t>{{#amenitiesTable}}</w:t>
       </w:r>
@@ -1822,16 +1890,16 @@
     <w:p>
       <w:pPr>
         <w:keepNext w:val="0"/>
-        <w:spacing w:before="0" w:after="40" w:line="269" w:lineRule="auto"/>
-        <w:ind w:left="0"/>
+        <w:spacing w:before="0" w:after="80" w:line="276" w:lineRule="auto"/>
         <w:jc w:val="both"/>
+        <w:widowControl w:val="1"/>
       </w:pPr>
       <w:r>
         <w:rPr>
           <w:rFonts w:ascii="Times New Roman" w:hAnsi="Times New Roman" w:eastAsia="Times New Roman"/>
           <w:b w:val="0"/>
           <w:i w:val="0"/>
-          <w:sz w:val="26"/>
+          <w:sz w:val="24"/>
         </w:rPr>
         <w:t>4.3. Đối với tiện ích dùng chung (nếu có), Bên B được quyền sử dụng các tiện ích chung theo nội quy, khung giờ và tình trạng vận hành của đơn vị quản lý.</w:t>
       </w:r>
@@ -1839,9 +1907,9 @@
     <w:p>
       <w:pPr>
         <w:keepNext/>
-        <w:spacing w:before="100" w:after="60" w:line="269" w:lineRule="auto"/>
-        <w:ind w:left="0"/>
-        <w:jc w:val="left"/>
+        <w:spacing w:before="160" w:after="80" w:line="276" w:lineRule="auto"/>
+        <w:jc w:val="both"/>
+        <w:widowControl w:val="1"/>
       </w:pPr>
       <w:r>
         <w:rPr>
@@ -1856,16 +1924,16 @@
     <w:p>
       <w:pPr>
         <w:keepNext/>
-        <w:spacing w:before="0" w:after="20" w:line="269" w:lineRule="auto"/>
-        <w:ind w:left="0"/>
+        <w:spacing w:before="0" w:after="40" w:line="276" w:lineRule="auto"/>
         <w:jc w:val="both"/>
+        <w:widowControl w:val="1"/>
       </w:pPr>
       <w:r>
         <w:rPr>
           <w:rFonts w:ascii="Times New Roman" w:hAnsi="Times New Roman" w:eastAsia="Times New Roman"/>
           <w:b/>
           <w:i w:val="0"/>
-          <w:sz w:val="26"/>
+          <w:sz w:val="24"/>
         </w:rPr>
         <w:t>5.1. Danh mục trang thiết bị, nội thất gắn liền căn nhà:</w:t>
       </w:r>
@@ -1873,16 +1941,16 @@
     <w:p>
       <w:pPr>
         <w:keepNext w:val="0"/>
-        <w:spacing w:before="0" w:after="60" w:line="269" w:lineRule="auto"/>
-        <w:ind w:left="0"/>
+        <w:spacing w:before="0" w:after="80" w:line="276" w:lineRule="auto"/>
         <w:jc w:val="center"/>
+        <w:widowControl w:val="1"/>
       </w:pPr>
       <w:r>
         <w:rPr>
           <w:rFonts w:ascii="Times New Roman" w:hAnsi="Times New Roman" w:eastAsia="Times New Roman"/>
           <w:b/>
           <w:i w:val="0"/>
-          <w:sz w:val="26"/>
+          <w:sz w:val="24"/>
         </w:rPr>
         <w:t>{{#equipmentTable}}</w:t>
       </w:r>
@@ -1890,16 +1958,16 @@
     <w:p>
       <w:pPr>
         <w:keepNext w:val="0"/>
-        <w:spacing w:before="0" w:after="40" w:line="269" w:lineRule="auto"/>
-        <w:ind w:left="0"/>
+        <w:spacing w:before="0" w:after="80" w:line="276" w:lineRule="auto"/>
         <w:jc w:val="both"/>
+        <w:widowControl w:val="1"/>
       </w:pPr>
       <w:r>
         <w:rPr>
           <w:rFonts w:ascii="Times New Roman" w:hAnsi="Times New Roman" w:eastAsia="Times New Roman"/>
           <w:b w:val="0"/>
           <w:i w:val="0"/>
-          <w:sz w:val="26"/>
+          <w:sz w:val="24"/>
         </w:rPr>
         <w:t>5.2. Bên B có trách nhiệm bảo quản nguyên vẹn, không tự ý thay đổi kết cấu chịu lực, không đục phá tường, cơi nới nếu chưa có sự đồng ý bằng văn bản của Bên A.</w:t>
       </w:r>
@@ -1907,9 +1975,9 @@
     <w:p>
       <w:pPr>
         <w:keepNext/>
-        <w:spacing w:before="100" w:after="60" w:line="269" w:lineRule="auto"/>
-        <w:ind w:left="0"/>
-        <w:jc w:val="left"/>
+        <w:spacing w:before="160" w:after="80" w:line="276" w:lineRule="auto"/>
+        <w:jc w:val="both"/>
+        <w:widowControl w:val="1"/>
       </w:pPr>
       <w:r>
         <w:rPr>
@@ -1924,16 +1992,16 @@
     <w:p>
       <w:pPr>
         <w:keepNext w:val="0"/>
-        <w:spacing w:before="0" w:after="40" w:line="269" w:lineRule="auto"/>
-        <w:ind w:left="0"/>
+        <w:spacing w:before="0" w:after="80" w:line="276" w:lineRule="auto"/>
         <w:jc w:val="both"/>
+        <w:widowControl w:val="1"/>
       </w:pPr>
       <w:r>
         <w:rPr>
           <w:rFonts w:ascii="Times New Roman" w:hAnsi="Times New Roman" w:eastAsia="Times New Roman"/>
           <w:b w:val="0"/>
           <w:i w:val="0"/>
-          <w:sz w:val="26"/>
+          <w:sz w:val="24"/>
         </w:rPr>
         <w:t>6.1. Bàn giao nhà và thiết bị đúng hạn; bảo đảm quyền sử dụng độc lập, hợp pháp cho Bên B.</w:t>
       </w:r>
@@ -1941,16 +2009,16 @@
     <w:p>
       <w:pPr>
         <w:keepNext w:val="0"/>
-        <w:spacing w:before="0" w:after="40" w:line="269" w:lineRule="auto"/>
-        <w:ind w:left="0"/>
+        <w:spacing w:before="0" w:after="80" w:line="276" w:lineRule="auto"/>
         <w:jc w:val="both"/>
+        <w:widowControl w:val="1"/>
       </w:pPr>
       <w:r>
         <w:rPr>
           <w:rFonts w:ascii="Times New Roman" w:hAnsi="Times New Roman" w:eastAsia="Times New Roman"/>
           <w:b w:val="0"/>
           <w:i w:val="0"/>
-          <w:sz w:val="26"/>
+          <w:sz w:val="24"/>
         </w:rPr>
         <w:t>6.2. Cung cấp tài khoản ngân hàng chính xác để nhận thanh toán; kiểm tra và xác nhận kịp thời khi nhận được tiền.</w:t>
       </w:r>
@@ -1958,16 +2026,16 @@
     <w:p>
       <w:pPr>
         <w:keepNext w:val="0"/>
-        <w:spacing w:before="0" w:after="40" w:line="269" w:lineRule="auto"/>
-        <w:ind w:left="0"/>
+        <w:spacing w:before="0" w:after="80" w:line="276" w:lineRule="auto"/>
         <w:jc w:val="both"/>
+        <w:widowControl w:val="1"/>
       </w:pPr>
       <w:r>
         <w:rPr>
           <w:rFonts w:ascii="Times New Roman" w:hAnsi="Times New Roman" w:eastAsia="Times New Roman"/>
           <w:b w:val="0"/>
           <w:i w:val="0"/>
-          <w:sz w:val="26"/>
+          <w:sz w:val="24"/>
         </w:rPr>
         <w:t>6.3. Hướng dẫn thủ tục đăng ký tạm trú theo Luật Cư trú; bảo trì kết cấu căn nhà theo thỏa thuận.</w:t>
       </w:r>
@@ -1975,9 +2043,9 @@
     <w:p>
       <w:pPr>
         <w:keepNext/>
-        <w:spacing w:before="100" w:after="60" w:line="269" w:lineRule="auto"/>
-        <w:ind w:left="0"/>
-        <w:jc w:val="left"/>
+        <w:spacing w:before="160" w:after="80" w:line="276" w:lineRule="auto"/>
+        <w:jc w:val="both"/>
+        <w:widowControl w:val="1"/>
       </w:pPr>
       <w:r>
         <w:rPr>
@@ -1992,16 +2060,16 @@
     <w:p>
       <w:pPr>
         <w:keepNext w:val="0"/>
-        <w:spacing w:before="0" w:after="40" w:line="269" w:lineRule="auto"/>
-        <w:ind w:left="0"/>
+        <w:spacing w:before="0" w:after="80" w:line="276" w:lineRule="auto"/>
         <w:jc w:val="both"/>
+        <w:widowControl w:val="1"/>
       </w:pPr>
       <w:r>
         <w:rPr>
           <w:rFonts w:ascii="Times New Roman" w:hAnsi="Times New Roman" w:eastAsia="Times New Roman"/>
           <w:b w:val="0"/>
           <w:i w:val="0"/>
-          <w:sz w:val="26"/>
+          <w:sz w:val="24"/>
         </w:rPr>
         <w:t>7.1. Sử dụng đúng số lượng người cư trú (</w:t>
       </w:r>
@@ -2010,7 +2078,7 @@
           <w:rFonts w:ascii="Times New Roman" w:hAnsi="Times New Roman" w:eastAsia="Times New Roman"/>
           <w:b w:val="0"/>
           <w:i w:val="0"/>
-          <w:sz w:val="26"/>
+          <w:sz w:val="24"/>
         </w:rPr>
         <w:t>{{tenant.occupantCount}}</w:t>
       </w:r>
@@ -2019,7 +2087,7 @@
           <w:rFonts w:ascii="Times New Roman" w:hAnsi="Times New Roman" w:eastAsia="Times New Roman"/>
           <w:b w:val="0"/>
           <w:i w:val="0"/>
-          <w:sz w:val="26"/>
+          <w:sz w:val="24"/>
         </w:rPr>
         <w:t xml:space="preserve"> người), đúng số lượng phương tiện đăng ký (</w:t>
       </w:r>
@@ -2028,7 +2096,7 @@
           <w:rFonts w:ascii="Times New Roman" w:hAnsi="Times New Roman" w:eastAsia="Times New Roman"/>
           <w:b w:val="0"/>
           <w:i w:val="0"/>
-          <w:sz w:val="26"/>
+          <w:sz w:val="24"/>
         </w:rPr>
         <w:t>{{tenant.motorbikeCount}}</w:t>
       </w:r>
@@ -2037,7 +2105,7 @@
           <w:rFonts w:ascii="Times New Roman" w:hAnsi="Times New Roman" w:eastAsia="Times New Roman"/>
           <w:b w:val="0"/>
           <w:i w:val="0"/>
-          <w:sz w:val="26"/>
+          <w:sz w:val="24"/>
         </w:rPr>
         <w:t xml:space="preserve"> xe máy, </w:t>
       </w:r>
@@ -2046,7 +2114,7 @@
           <w:rFonts w:ascii="Times New Roman" w:hAnsi="Times New Roman" w:eastAsia="Times New Roman"/>
           <w:b w:val="0"/>
           <w:i w:val="0"/>
-          <w:sz w:val="26"/>
+          <w:sz w:val="24"/>
         </w:rPr>
         <w:t>{{tenant.carCount}}</w:t>
       </w:r>
@@ -2055,7 +2123,7 @@
           <w:rFonts w:ascii="Times New Roman" w:hAnsi="Times New Roman" w:eastAsia="Times New Roman"/>
           <w:b w:val="0"/>
           <w:i w:val="0"/>
-          <w:sz w:val="26"/>
+          <w:sz w:val="24"/>
         </w:rPr>
         <w:t xml:space="preserve"> ô tô).</w:t>
       </w:r>
@@ -2063,33 +2131,33 @@
     <w:p>
       <w:pPr>
         <w:keepNext w:val="0"/>
-        <w:spacing w:before="0" w:after="40" w:line="269" w:lineRule="auto"/>
-        <w:ind w:left="0"/>
+        <w:spacing w:before="0" w:after="80" w:line="276" w:lineRule="auto"/>
         <w:jc w:val="both"/>
+        <w:widowControl w:val="1"/>
       </w:pPr>
       <w:r>
         <w:rPr>
           <w:rFonts w:ascii="Times New Roman" w:hAnsi="Times New Roman" w:eastAsia="Times New Roman"/>
           <w:b w:val="0"/>
           <w:i w:val="0"/>
-          <w:sz w:val="26"/>
+          <w:sz w:val="24"/>
         </w:rPr>
-        <w:t>7.2. Chấp hành tuyệt đối các quy định an toàn PCCC, an ninh trật tự địa phương.</w:t>
+        <w:t>7.2. Chấp hành tuyệt đối các quy định an toàn PCCC theo Luật PCCC 2024, an ninh trật tự địa phương.</w:t>
       </w:r>
     </w:p>
     <w:p>
       <w:pPr>
         <w:keepNext w:val="0"/>
-        <w:spacing w:before="0" w:after="40" w:line="269" w:lineRule="auto"/>
-        <w:ind w:left="0"/>
+        <w:spacing w:before="0" w:after="80" w:line="276" w:lineRule="auto"/>
         <w:jc w:val="both"/>
+        <w:widowControl w:val="1"/>
       </w:pPr>
       <w:r>
         <w:rPr>
           <w:rFonts w:ascii="Times New Roman" w:hAnsi="Times New Roman" w:eastAsia="Times New Roman"/>
           <w:b w:val="0"/>
           <w:i w:val="0"/>
-          <w:sz w:val="26"/>
+          <w:sz w:val="24"/>
         </w:rPr>
         <w:t>7.3. Chuyển khoản tiền thuê và chi phí đầy đủ, đúng hạn vào tài khoản ngân hàng của Bên A.</w:t>
       </w:r>
@@ -2097,9 +2165,9 @@
     <w:p>
       <w:pPr>
         <w:keepNext/>
-        <w:spacing w:before="100" w:after="60" w:line="269" w:lineRule="auto"/>
-        <w:ind w:left="0"/>
-        <w:jc w:val="left"/>
+        <w:spacing w:before="160" w:after="80" w:line="276" w:lineRule="auto"/>
+        <w:jc w:val="both"/>
+        <w:widowControl w:val="1"/>
       </w:pPr>
       <w:r>
         <w:rPr>
@@ -2108,22 +2176,22 @@
           <w:i w:val="0"/>
           <w:sz w:val="26"/>
         </w:rPr>
-        <w:t>ĐIỀU 8. ĐIỀU KHOẢN VỀ VẬT NUÔI VÀ THỎA THUẬN KHÁC</w:t>
+        <w:t>ĐIỀU 8. ĐIỀU KHOẢN ĐẶC THÙ VỀ THÚ CƯNG VÀ NỘI QUY</w:t>
       </w:r>
     </w:p>
     <w:p>
       <w:pPr>
         <w:keepNext w:val="0"/>
-        <w:spacing w:before="0" w:after="40" w:line="269" w:lineRule="auto"/>
-        <w:ind w:left="0"/>
+        <w:spacing w:before="0" w:after="80" w:line="276" w:lineRule="auto"/>
         <w:jc w:val="both"/>
+        <w:widowControl w:val="1"/>
       </w:pPr>
       <w:r>
         <w:rPr>
           <w:rFonts w:ascii="Times New Roman" w:hAnsi="Times New Roman" w:eastAsia="Times New Roman"/>
           <w:b w:val="0"/>
           <w:i w:val="0"/>
-          <w:sz w:val="26"/>
+          <w:sz w:val="24"/>
         </w:rPr>
         <w:t>8.1. Quy định về nuôi thú cưng (nếu được phép theo Bảng tiện ích): Bên B cam kết giữ vệ sinh, đảm bảo an toàn, không gây tiếng ồn ảnh hưởng xung quanh và bồi thường 100% nếu gây thiệt hại.</w:t>
       </w:r>
@@ -2131,25 +2199,25 @@
     <w:p>
       <w:pPr>
         <w:keepNext w:val="0"/>
-        <w:spacing w:before="0" w:after="40" w:line="269" w:lineRule="auto"/>
-        <w:ind w:left="0"/>
+        <w:spacing w:before="0" w:after="80" w:line="276" w:lineRule="auto"/>
         <w:jc w:val="both"/>
+        <w:widowControl w:val="1"/>
       </w:pPr>
       <w:r>
         <w:rPr>
           <w:rFonts w:ascii="Times New Roman" w:hAnsi="Times New Roman" w:eastAsia="Times New Roman"/>
           <w:b w:val="0"/>
           <w:i w:val="0"/>
-          <w:sz w:val="26"/>
+          <w:sz w:val="24"/>
         </w:rPr>
-        <w:t xml:space="preserve">8.2. Thỏa thuận bổ sung: </w:t>
+        <w:t xml:space="preserve">8.2. Điều khoản đặc biệt khác: </w:t>
       </w:r>
       <w:r>
         <w:rPr>
           <w:rFonts w:ascii="Times New Roman" w:hAnsi="Times New Roman" w:eastAsia="Times New Roman"/>
           <w:b w:val="0"/>
           <w:i w:val="0"/>
-          <w:sz w:val="26"/>
+          <w:sz w:val="24"/>
         </w:rPr>
         <w:t>{{contract.specialTerms}}</w:t>
       </w:r>
@@ -2158,7 +2226,7 @@
           <w:rFonts w:ascii="Times New Roman" w:hAnsi="Times New Roman" w:eastAsia="Times New Roman"/>
           <w:b w:val="0"/>
           <w:i w:val="0"/>
-          <w:sz w:val="26"/>
+          <w:sz w:val="24"/>
         </w:rPr>
         <w:t>.</w:t>
       </w:r>
@@ -2166,9 +2234,9 @@
     <w:p>
       <w:pPr>
         <w:keepNext/>
-        <w:spacing w:before="100" w:after="60" w:line="269" w:lineRule="auto"/>
-        <w:ind w:left="0"/>
-        <w:jc w:val="left"/>
+        <w:spacing w:before="160" w:after="80" w:line="276" w:lineRule="auto"/>
+        <w:jc w:val="both"/>
+        <w:widowControl w:val="1"/>
       </w:pPr>
       <w:r>
         <w:rPr>
@@ -2183,43 +2251,43 @@
     <w:p>
       <w:pPr>
         <w:keepNext w:val="0"/>
-        <w:spacing w:before="0" w:after="40" w:line="269" w:lineRule="auto"/>
-        <w:ind w:left="0"/>
+        <w:spacing w:before="0" w:after="80" w:line="276" w:lineRule="auto"/>
         <w:jc w:val="both"/>
+        <w:widowControl w:val="1"/>
       </w:pPr>
       <w:r>
         <w:rPr>
           <w:rFonts w:ascii="Times New Roman" w:hAnsi="Times New Roman" w:eastAsia="Times New Roman"/>
           <w:b w:val="0"/>
           <w:i w:val="0"/>
-          <w:sz w:val="26"/>
+          <w:sz w:val="24"/>
         </w:rPr>
-        <w:t>9.1. Việc chấm dứt hợp đồng, thông báo trước, hoàn trả nhà và quyết toán hoàn cọc chuyển khoản trực tiếp thực hiện theo thỏa thuận của các bên và pháp luật áp dụng.</w:t>
+        <w:t>9.1. Quy định thông báo trước khi chấm dứt hợp đồng; hoàn trả nhà và quyết toán hoàn cọc chuyển khoản trực tiếp.</w:t>
       </w:r>
     </w:p>
     <w:p>
       <w:pPr>
         <w:keepNext w:val="0"/>
-        <w:spacing w:before="0" w:after="40" w:line="269" w:lineRule="auto"/>
-        <w:ind w:left="0"/>
+        <w:spacing w:before="0" w:after="80" w:line="276" w:lineRule="auto"/>
         <w:jc w:val="both"/>
+        <w:widowControl w:val="1"/>
       </w:pPr>
       <w:r>
         <w:rPr>
           <w:rFonts w:ascii="Times New Roman" w:hAnsi="Times New Roman" w:eastAsia="Times New Roman"/>
           <w:b w:val="0"/>
           <w:i w:val="0"/>
-          <w:sz w:val="26"/>
+          <w:sz w:val="24"/>
         </w:rPr>
-        <w:t>9.2. Tranh chấp trước hết được giải quyết thông qua thương lượng; nếu không thành, các bên có quyền yêu cầu Tòa án có thẩm quyền giải quyết theo pháp luật.</w:t>
+        <w:t>9.2. Trường hợp bất khả kháng; giải quyết tranh chấp thông qua thương lượng hoặc Tòa án có thẩm quyền.</w:t>
       </w:r>
     </w:p>
     <w:p>
       <w:pPr>
         <w:keepNext/>
-        <w:spacing w:before="100" w:after="60" w:line="269" w:lineRule="auto"/>
-        <w:ind w:left="0"/>
-        <w:jc w:val="left"/>
+        <w:spacing w:before="160" w:after="80" w:line="276" w:lineRule="auto"/>
+        <w:jc w:val="both"/>
+        <w:widowControl w:val="1"/>
       </w:pPr>
       <w:r>
         <w:rPr>
@@ -2234,16 +2302,16 @@
     <w:p>
       <w:pPr>
         <w:keepNext w:val="0"/>
-        <w:spacing w:before="0" w:after="40" w:line="269" w:lineRule="auto"/>
-        <w:ind w:left="0"/>
+        <w:spacing w:before="0" w:after="80" w:line="276" w:lineRule="auto"/>
         <w:jc w:val="both"/>
+        <w:widowControl w:val="1"/>
       </w:pPr>
       <w:r>
         <w:rPr>
           <w:rFonts w:ascii="Times New Roman" w:hAnsi="Times New Roman" w:eastAsia="Times New Roman"/>
           <w:b w:val="0"/>
           <w:i w:val="0"/>
-          <w:sz w:val="26"/>
+          <w:sz w:val="24"/>
         </w:rPr>
         <w:t>10.1. Hợp đồng được giao kết điện tử/xác nhận thông qua nền tảng HomeSpace phù hợp Luật Giao dịch điện tử.</w:t>
       </w:r>
@@ -2251,16 +2319,16 @@
     <w:p>
       <w:pPr>
         <w:keepNext w:val="0"/>
-        <w:spacing w:before="0" w:after="40" w:line="269" w:lineRule="auto"/>
-        <w:ind w:left="0"/>
+        <w:spacing w:before="0" w:after="80" w:line="276" w:lineRule="auto"/>
         <w:jc w:val="both"/>
+        <w:widowControl w:val="1"/>
       </w:pPr>
       <w:r>
         <w:rPr>
           <w:rFonts w:ascii="Times New Roman" w:hAnsi="Times New Roman" w:eastAsia="Times New Roman"/>
           <w:b w:val="0"/>
           <w:i w:val="0"/>
-          <w:sz w:val="26"/>
+          <w:sz w:val="24"/>
         </w:rPr>
         <w:t xml:space="preserve">10.2. Phiên bản schema: </w:t>
       </w:r>
@@ -2269,7 +2337,7 @@
           <w:rFonts w:ascii="Times New Roman" w:hAnsi="Times New Roman" w:eastAsia="Times New Roman"/>
           <w:b w:val="0"/>
           <w:i w:val="0"/>
-          <w:sz w:val="26"/>
+          <w:sz w:val="24"/>
         </w:rPr>
         <w:t>{{contract.schemaVersion}}</w:t>
       </w:r>
@@ -2278,16 +2346,16 @@
           <w:rFonts w:ascii="Times New Roman" w:hAnsi="Times New Roman" w:eastAsia="Times New Roman"/>
           <w:b w:val="0"/>
           <w:i w:val="0"/>
-          <w:sz w:val="26"/>
+          <w:sz w:val="24"/>
         </w:rPr>
-        <w:t xml:space="preserve">; Số hiệu bản sửa đổi: </w:t>
+        <w:t xml:space="preserve">, Số hiệu bản sửa đổi: </w:t>
       </w:r>
       <w:r>
         <w:rPr>
           <w:rFonts w:ascii="Times New Roman" w:hAnsi="Times New Roman" w:eastAsia="Times New Roman"/>
           <w:b w:val="0"/>
           <w:i w:val="0"/>
-          <w:sz w:val="26"/>
+          <w:sz w:val="24"/>
         </w:rPr>
         <w:t>{{contract.revisionNumber}}</w:t>
       </w:r>
@@ -2296,7 +2364,7 @@
           <w:rFonts w:ascii="Times New Roman" w:hAnsi="Times New Roman" w:eastAsia="Times New Roman"/>
           <w:b w:val="0"/>
           <w:i w:val="0"/>
-          <w:sz w:val="26"/>
+          <w:sz w:val="24"/>
         </w:rPr>
         <w:t>.</w:t>
       </w:r>
@@ -2304,144 +2372,25 @@
     <w:p>
       <w:pPr>
         <w:keepNext w:val="0"/>
-        <w:spacing w:before="0" w:after="40" w:line="269" w:lineRule="auto"/>
-        <w:ind w:left="0"/>
+        <w:spacing w:before="0" w:after="0" w:line="276" w:lineRule="auto"/>
         <w:jc w:val="both"/>
+        <w:widowControl w:val="1"/>
       </w:pPr>
       <w:r>
         <w:rPr>
           <w:rFonts w:ascii="Times New Roman" w:hAnsi="Times New Roman" w:eastAsia="Times New Roman"/>
           <w:b w:val="0"/>
           <w:i w:val="0"/>
-          <w:sz w:val="26"/>
+          <w:sz w:val="24"/>
         </w:rPr>
         <w:t>10.3. Hợp đồng có hiệu lực kể từ thời điểm hai bên hoàn tất xác nhận/ký điện tử.</w:t>
       </w:r>
     </w:p>
-    <w:p>
-      <w:pPr>
-        <w:keepNext/>
-        <w:spacing w:before="140" w:after="80" w:line="269" w:lineRule="auto"/>
-        <w:ind w:left="0"/>
-        <w:jc w:val="center"/>
-      </w:pPr>
-      <w:r>
-        <w:rPr>
-          <w:rFonts w:ascii="Times New Roman" w:hAnsi="Times New Roman" w:eastAsia="Times New Roman"/>
-          <w:b/>
-          <w:i w:val="0"/>
-          <w:sz w:val="26"/>
-        </w:rPr>
-        <w:t>ĐẠI DIỆN CÁC BÊN KÝ/XÁC NHẬN</w:t>
-      </w:r>
-    </w:p>
-    <w:tbl>
-      <w:tblPr>
-        <w:tblW w:type="auto" w:w="0"/>
-        <w:jc w:val="center"/>
-        <w:tblLayout w:type="fixed"/>
-        <w:tblLook w:firstColumn="1" w:firstRow="1" w:lastColumn="0" w:lastRow="0" w:noHBand="0" w:noVBand="1" w:val="04A0"/>
-      </w:tblPr>
-      <w:tblGrid>
-        <w:gridCol w:w="4986"/>
-        <w:gridCol w:w="4986"/>
-      </w:tblGrid>
-      <w:tr>
-        <w:tc>
-          <w:tcPr>
-            <w:tcW w:type="dxa" w:w="4649"/>
-            <w:vAlign w:val="center"/>
-          </w:tcPr>
-          <w:p>
-            <w:pPr>
-              <w:jc w:val="center"/>
-            </w:pPr>
-            <w:r>
-              <w:rPr>
-                <w:rFonts w:ascii="Times New Roman" w:hAnsi="Times New Roman" w:eastAsia="Times New Roman"/>
-                <w:b/>
-                <w:i w:val="0"/>
-                <w:sz w:val="26"/>
-              </w:rPr>
-              <w:t>ĐẠI DIỆN BÊN A</w:t>
-            </w:r>
-          </w:p>
-        </w:tc>
-        <w:tc>
-          <w:tcPr>
-            <w:tcW w:type="dxa" w:w="4649"/>
-            <w:vAlign w:val="center"/>
-          </w:tcPr>
-          <w:p>
-            <w:pPr>
-              <w:jc w:val="center"/>
-            </w:pPr>
-            <w:r>
-              <w:rPr>
-                <w:rFonts w:ascii="Times New Roman" w:hAnsi="Times New Roman" w:eastAsia="Times New Roman"/>
-                <w:b/>
-                <w:i w:val="0"/>
-                <w:sz w:val="26"/>
-              </w:rPr>
-              <w:t>ĐẠI DIỆN BÊN B</w:t>
-            </w:r>
-          </w:p>
-        </w:tc>
-      </w:tr>
-      <w:tr>
-        <w:tc>
-          <w:tcPr>
-            <w:tcW w:type="dxa" w:w="4649"/>
-          </w:tcPr>
-          <w:p>
-            <w:pPr>
-              <w:jc w:val="center"/>
-            </w:pPr>
-            <w:r>
-              <w:rPr>
-                <w:rFonts w:ascii="Times New Roman" w:hAnsi="Times New Roman" w:eastAsia="Times New Roman"/>
-                <w:b w:val="0"/>
-                <w:i w:val="0"/>
-                <w:sz w:val="26"/>
-              </w:rPr>
-              <w:t>(Ký, ghi rõ họ tên hoặc ký điện tử)</w:t>
-            </w:r>
-          </w:p>
-          <w:p/>
-          <w:p/>
-          <w:p/>
-          <w:p/>
-        </w:tc>
-        <w:tc>
-          <w:tcPr>
-            <w:tcW w:type="dxa" w:w="4649"/>
-          </w:tcPr>
-          <w:p>
-            <w:pPr>
-              <w:jc w:val="center"/>
-            </w:pPr>
-            <w:r>
-              <w:rPr>
-                <w:rFonts w:ascii="Times New Roman" w:hAnsi="Times New Roman" w:eastAsia="Times New Roman"/>
-                <w:b w:val="0"/>
-                <w:i w:val="0"/>
-                <w:sz w:val="26"/>
-              </w:rPr>
-              <w:t>(Ký, ghi rõ họ tên hoặc ký điện tử)</w:t>
-            </w:r>
-          </w:p>
-          <w:p/>
-          <w:p/>
-          <w:p/>
-          <w:p/>
-        </w:tc>
-      </w:tr>
-    </w:tbl>
     <w:sectPr>
       <w:headerReference w:type="default" r:id="rId9"/>
       <w:footerReference w:type="default" r:id="rId10"/>
-      <w:pgSz w:w="12240" w:h="15840"/>
-      <w:pgMar w:top="964" w:right="1020" w:bottom="964" w:left="1247" w:header="720" w:footer="720" w:gutter="0"/>
+      <w:pgSz w:w="11906" w:h="16838"/>
+      <w:pgMar w:top="1701" w:right="1417" w:bottom="1417" w:left="1417" w:header="709" w:footer="709" w:gutter="0"/>
       <w:cols w:space="720"/>
       <w:docGrid w:linePitch="360"/>
     </w:sectPr>
@@ -2454,20 +2403,8 @@
   <w:p>
     <w:pPr>
       <w:pStyle w:val="Footer"/>
-      <w:jc w:val="center"/>
     </w:pPr>
-    <w:r>
-      <w:rPr>
-        <w:rFonts w:ascii="Times New Roman" w:hAnsi="Times New Roman" w:eastAsia="Times New Roman"/>
-        <w:b w:val="0"/>
-        <w:i w:val="0"/>
-        <w:sz w:val="18"/>
-      </w:rPr>
-      <w:t xml:space="preserve">Trang </w:t>
-      <w:fldChar w:fldCharType="begin"/>
-      <w:instrText xml:space="preserve">PAGE</w:instrText>
-      <w:fldChar w:fldCharType="end"/>
-    </w:r>
+    <w:r/>
   </w:p>
 </w:ftr>
 </file>
@@ -2477,14 +2414,16 @@
   <w:p>
     <w:pPr>
       <w:pStyle w:val="Header"/>
+      <w:spacing w:after="0"/>
       <w:jc w:val="right"/>
     </w:pPr>
     <w:r>
       <w:rPr>
         <w:rFonts w:ascii="Times New Roman" w:hAnsi="Times New Roman" w:eastAsia="Times New Roman"/>
         <w:b w:val="0"/>
-        <w:i/>
-        <w:sz w:val="18"/>
+        <w:i w:val="0"/>
+        <w:color w:val="969696"/>
+        <w:sz w:val="16"/>
       </w:rPr>
       <w:t>HomeSpace | Mẫu hợp đồng điện tử | Nhà nguyên căn</w:t>
     </w:r>
@@ -2855,9 +2794,12 @@
     <w:name w:val="Normal"/>
     <w:qFormat/>
     <w:rsid w:val="00FC693F"/>
+    <w:pPr>
+      <w:spacing w:line="276" w:lineRule="auto" w:after="80"/>
+    </w:pPr>
     <w:rPr>
       <w:rFonts w:ascii="Times New Roman" w:hAnsi="Times New Roman" w:eastAsia="Times New Roman"/>
-      <w:sz w:val="26"/>
+      <w:sz w:val="24"/>
     </w:rPr>
   </w:style>
   <w:style w:type="paragraph" w:styleId="Header">

</xml_diff>